<commit_message>
Tweaks and updating word doc
</commit_message>
<xml_diff>
--- a/word/cv.docx
+++ b/word/cv.docx
@@ -1,18 +1,18 @@
 
 <file path=word/document.xml><?xml version="1.0" encoding="utf-8"?>
-<w:document xmlns:wpc="http://schemas.microsoft.com/office/word/2010/wordprocessingCanvas" xmlns:cx="http://schemas.microsoft.com/office/drawing/2014/chartex" xmlns:cx1="http://schemas.microsoft.com/office/drawing/2015/9/8/chartex" xmlns:cx2="http://schemas.microsoft.com/office/drawing/2015/10/21/chartex" xmlns:cx3="http://schemas.microsoft.com/office/drawing/2016/5/9/chartex" xmlns:cx4="http://schemas.microsoft.com/office/drawing/2016/5/10/chartex" xmlns:cx5="http://schemas.microsoft.com/office/drawing/2016/5/11/chartex" xmlns:cx6="http://schemas.microsoft.com/office/drawing/2016/5/12/chartex" xmlns:cx7="http://schemas.microsoft.com/office/drawing/2016/5/13/chartex" xmlns:cx8="http://schemas.microsoft.com/office/drawing/2016/5/14/chartex" xmlns:mc="http://schemas.openxmlformats.org/markup-compatibility/2006" xmlns:aink="http://schemas.microsoft.com/office/drawing/2016/ink" xmlns:am3d="http://schemas.microsoft.com/office/drawing/2017/model3d" xmlns:o="urn:schemas-microsoft-com:office:office" xmlns:oel="http://schemas.microsoft.com/office/2019/extlst" xmlns:r="http://schemas.openxmlformats.org/officeDocument/2006/relationships" xmlns:m="http://schemas.openxmlformats.org/officeDocument/2006/math" xmlns:v="urn:schemas-microsoft-com:vml" xmlns:wp14="http://schemas.microsoft.com/office/word/2010/wordprocessingDrawing" xmlns:wp="http://schemas.openxmlformats.org/drawingml/2006/wordprocessingDrawing" xmlns:w10="urn:schemas-microsoft-com:office:word" xmlns:w="http://schemas.openxmlformats.org/wordprocessingml/2006/main" xmlns:w14="http://schemas.microsoft.com/office/word/2010/wordml" xmlns:w15="http://schemas.microsoft.com/office/word/2012/wordml" xmlns:w16cex="http://schemas.microsoft.com/office/word/2018/wordml/cex" xmlns:w16cid="http://schemas.microsoft.com/office/word/2016/wordml/cid" xmlns:w16="http://schemas.microsoft.com/office/word/2018/wordml" xmlns:w16du="http://schemas.microsoft.com/office/word/2023/wordml/word16du" xmlns:w16sdtdh="http://schemas.microsoft.com/office/word/2020/wordml/sdtdatahash" xmlns:w16se="http://schemas.microsoft.com/office/word/2015/wordml/symex" xmlns:wpg="http://schemas.microsoft.com/office/word/2010/wordprocessingGroup" xmlns:wpi="http://schemas.microsoft.com/office/word/2010/wordprocessingInk" xmlns:wne="http://schemas.microsoft.com/office/word/2006/wordml" xmlns:wps="http://schemas.microsoft.com/office/word/2010/wordprocessingShape" mc:Ignorable="w14 w15 w16se w16cid w16 w16cex w16sdtdh w16du wp14">
+<w:document xmlns:wpc="http://schemas.microsoft.com/office/word/2010/wordprocessingCanvas" xmlns:cx="http://schemas.microsoft.com/office/drawing/2014/chartex" xmlns:cx1="http://schemas.microsoft.com/office/drawing/2015/9/8/chartex" xmlns:cx2="http://schemas.microsoft.com/office/drawing/2015/10/21/chartex" xmlns:cx3="http://schemas.microsoft.com/office/drawing/2016/5/9/chartex" xmlns:cx4="http://schemas.microsoft.com/office/drawing/2016/5/10/chartex" xmlns:cx5="http://schemas.microsoft.com/office/drawing/2016/5/11/chartex" xmlns:cx6="http://schemas.microsoft.com/office/drawing/2016/5/12/chartex" xmlns:cx7="http://schemas.microsoft.com/office/drawing/2016/5/13/chartex" xmlns:cx8="http://schemas.microsoft.com/office/drawing/2016/5/14/chartex" xmlns:mc="http://schemas.openxmlformats.org/markup-compatibility/2006" xmlns:aink="http://schemas.microsoft.com/office/drawing/2016/ink" xmlns:am3d="http://schemas.microsoft.com/office/drawing/2017/model3d" xmlns:o="urn:schemas-microsoft-com:office:office" xmlns:oel="http://schemas.microsoft.com/office/2019/extlst" xmlns:r="http://schemas.openxmlformats.org/officeDocument/2006/relationships" xmlns:m="http://schemas.openxmlformats.org/officeDocument/2006/math" xmlns:v="urn:schemas-microsoft-com:vml" xmlns:wp14="http://schemas.microsoft.com/office/word/2010/wordprocessingDrawing" xmlns:wp="http://schemas.openxmlformats.org/drawingml/2006/wordprocessingDrawing" xmlns:w10="urn:schemas-microsoft-com:office:word" xmlns:w="http://schemas.openxmlformats.org/wordprocessingml/2006/main" xmlns:w14="http://schemas.microsoft.com/office/word/2010/wordml" xmlns:w15="http://schemas.microsoft.com/office/word/2012/wordml" xmlns:w16cex="http://schemas.microsoft.com/office/word/2018/wordml/cex" xmlns:w16cid="http://schemas.microsoft.com/office/word/2016/wordml/cid" xmlns:w16="http://schemas.microsoft.com/office/word/2018/wordml" xmlns:w16du="http://schemas.microsoft.com/office/word/2023/wordml/word16du" xmlns:w16sdtdh="http://schemas.microsoft.com/office/word/2020/wordml/sdtdatahash" xmlns:w16se="http://schemas.microsoft.com/office/word/2015/wordml/symex" xmlns:wpg="http://schemas.microsoft.com/office/word/2010/wordprocessingGroup" xmlns:wpi="http://schemas.microsoft.com/office/word/2010/wordprocessingInk" xmlns:wne="http://schemas.microsoft.com/office/word/2006/wordml" xmlns:wps="http://schemas.microsoft.com/office/word/2010/wordprocessingShape" xmlns:a="http://schemas.openxmlformats.org/drawingml/2006/main" xmlns:pic="http://schemas.openxmlformats.org/drawingml/2006/picture" xmlns:a14="http://schemas.microsoft.com/office/drawing/2010/main" mc:Ignorable="w14 w15 w16se w16cid w16 w16cex w16sdtdh w16du wp14">
   <w:body>
     <w:tbl>
       <w:tblPr>
         <w:tblStyle w:val="TableGrid"/>
         <w:tblW w:w="0" w:type="auto"/>
         <w:tblBorders>
-          <w:top w:val="none" w:sz="0" w:space="0" w:color="auto"/>
-          <w:left w:val="none" w:sz="0" w:space="0" w:color="auto"/>
-          <w:bottom w:val="none" w:sz="0" w:space="0" w:color="auto"/>
-          <w:right w:val="none" w:sz="0" w:space="0" w:color="auto"/>
-          <w:insideH w:val="none" w:sz="0" w:space="0" w:color="auto"/>
-          <w:insideV w:val="none" w:sz="0" w:space="0" w:color="auto"/>
+          <w:top w:val="none" w:color="auto" w:sz="0" w:space="0"/>
+          <w:left w:val="none" w:color="auto" w:sz="0" w:space="0"/>
+          <w:bottom w:val="none" w:color="auto" w:sz="0" w:space="0"/>
+          <w:right w:val="none" w:color="auto" w:sz="0" w:space="0"/>
+          <w:insideH w:val="none" w:color="auto" w:sz="0" w:space="0"/>
+          <w:insideV w:val="none" w:color="auto" w:sz="0" w:space="0"/>
         </w:tblBorders>
         <w:tblLook w:val="04A0" w:firstRow="1" w:lastRow="0" w:firstColumn="1" w:lastColumn="0" w:noHBand="0" w:noVBand="1"/>
       </w:tblPr>
@@ -24,12 +24,13 @@
         <w:tc>
           <w:tcPr>
             <w:tcW w:w="4788" w:type="dxa"/>
+            <w:tcMar/>
           </w:tcPr>
           <w:p>
             <w:pPr>
               <w:pStyle w:val="Nametitle"/>
             </w:pPr>
-            <w:bookmarkStart w:id="0" w:name="leigh-hunt"/>
+            <w:bookmarkStart w:name="leigh-hunt" w:id="0"/>
             <w:r>
               <w:t xml:space="preserve">Leigh </w:t>
             </w:r>
@@ -41,23 +42,28 @@
         <w:tc>
           <w:tcPr>
             <w:tcW w:w="4788" w:type="dxa"/>
+            <w:tcMar/>
             <w:vAlign w:val="bottom"/>
           </w:tcPr>
           <w:p>
             <w:pPr>
               <w:jc w:val="right"/>
+              <w:rPr>
+                <w:lang w:val="en-US"/>
+              </w:rPr>
             </w:pPr>
             <w:r>
+              <w:rPr>
+                <w:lang w:val="en-US"/>
+              </w:rPr>
               <w:t xml:space="preserve">Email: </w:t>
             </w:r>
-            <w:hyperlink r:id="rId7" w:tgtFrame="_blank" w:history="1">
-              <w:r>
-                <w:rPr>
-                  <w:rStyle w:val="Hyperlink"/>
-                </w:rPr>
-                <w:t>leigh@venari.co.nz</w:t>
-              </w:r>
-            </w:hyperlink>
+            <w:r>
+              <w:rPr>
+                <w:lang w:val="en-US"/>
+              </w:rPr>
+              <w:t>leigh.hunt@lynker-analytics.com</w:t>
+            </w:r>
           </w:p>
         </w:tc>
       </w:tr>
@@ -65,6 +71,7 @@
         <w:tc>
           <w:tcPr>
             <w:tcW w:w="4788" w:type="dxa"/>
+            <w:tcMar/>
           </w:tcPr>
           <w:p>
             <w:r>
@@ -75,6 +82,7 @@
         <w:tc>
           <w:tcPr>
             <w:tcW w:w="4788" w:type="dxa"/>
+            <w:tcMar/>
           </w:tcPr>
           <w:p>
             <w:pPr>
@@ -90,12 +98,14 @@
         <w:tc>
           <w:tcPr>
             <w:tcW w:w="4788" w:type="dxa"/>
+            <w:tcMar/>
           </w:tcPr>
           <w:p/>
         </w:tc>
         <w:tc>
           <w:tcPr>
             <w:tcW w:w="4788" w:type="dxa"/>
+            <w:tcMar/>
           </w:tcPr>
           <w:p>
             <w:pPr>
@@ -104,7 +114,7 @@
             <w:r>
               <w:t xml:space="preserve">Web: </w:t>
             </w:r>
-            <w:hyperlink r:id="rId8" w:tgtFrame="_blank" w:history="1">
+            <w:hyperlink w:tgtFrame="_blank" w:history="1" r:id="rId8">
               <w:r>
                 <w:rPr>
                   <w:rStyle w:val="Hyperlink"/>
@@ -129,7 +139,7 @@
       <w:pPr>
         <w:pStyle w:val="Heading1"/>
       </w:pPr>
-      <w:bookmarkStart w:id="1" w:name="about-me"/>
+      <w:bookmarkStart w:name="about-me" w:id="1"/>
       <w:bookmarkEnd w:id="0"/>
       <w:r>
         <w:t>About Me</w:t>
@@ -199,69 +209,730 @@
     </w:p>
     <w:p>
       <w:r>
-        <w:t>Hi, my name’s Leigh and I’m a Software Developer.</w:t>
-      </w:r>
-    </w:p>
-    <w:p>
-      <w:r>
-        <w:t>With nearly 30 years’ experience in the industry, I’ve been working in the New Zealand IT community for 17 years, including the last 14 as a business owner and contractor.</w:t>
-      </w:r>
-    </w:p>
-    <w:p>
-      <w:r>
-        <w:t xml:space="preserve">I mainly work in the DotNet and GIS </w:t>
-      </w:r>
-      <w:proofErr w:type="gramStart"/>
-      <w:r>
-        <w:t>spaces, and</w:t>
-      </w:r>
-      <w:proofErr w:type="gramEnd"/>
-      <w:r>
-        <w:t xml:space="preserve"> have strong interests in data visualisation and communication. I also design and develop software for embedded devices for data acquisition.</w:t>
-      </w:r>
-    </w:p>
-    <w:p>
-      <w:r>
-        <w:t xml:space="preserve">If you would like to read a more in-depth story about me, here’s an </w:t>
-      </w:r>
-      <w:hyperlink r:id="rId10">
+        <w:rPr>
+          <w:lang w:val="en-US"/>
+        </w:rPr>
+        <w:t xml:space="preserve">Hi, my name’s Leigh and </w:t>
+      </w:r>
+      <w:r>
+        <w:rPr>
+          <w:lang w:val="en-US"/>
+        </w:rPr>
+        <w:t>I’m</w:t>
+      </w:r>
+      <w:r>
+        <w:rPr>
+          <w:lang w:val="en-US"/>
+        </w:rPr>
+        <w:t xml:space="preserve"> a Software Developer.</w:t>
+      </w:r>
+    </w:p>
+    <w:p>
+      <w:pPr>
+        <w:rPr>
+          <w:lang w:val="en-US"/>
+        </w:rPr>
+      </w:pPr>
+      <w:r>
+        <w:rPr>
+          <w:lang w:val="en-US"/>
+        </w:rPr>
+        <w:t xml:space="preserve">With </w:t>
+      </w:r>
+      <w:r>
+        <w:rPr>
+          <w:lang w:val="en-US"/>
+        </w:rPr>
+        <w:t>30</w:t>
+      </w:r>
+      <w:r>
+        <w:rPr>
+          <w:lang w:val="en-US"/>
+        </w:rPr>
+        <w:t xml:space="preserve"> years’ experience in the ind</w:t>
+      </w:r>
+      <w:r>
+        <w:rPr>
+          <w:lang w:val="en-US"/>
+        </w:rPr>
+        <w:t>ustr</w:t>
+      </w:r>
+      <w:r>
+        <w:rPr>
+          <w:lang w:val="en-US"/>
+        </w:rPr>
+        <w:t xml:space="preserve">y, </w:t>
+      </w:r>
+      <w:r>
+        <w:rPr>
+          <w:lang w:val="en-US"/>
+        </w:rPr>
+        <w:t>I’ve</w:t>
+      </w:r>
+      <w:r>
+        <w:rPr>
+          <w:lang w:val="en-US"/>
+        </w:rPr>
+        <w:t xml:space="preserve"> been working in the New Zealand IT community for 17 years, including the last 14 as a business owner and contractor.</w:t>
+      </w:r>
+    </w:p>
+    <w:p>
+      <w:r>
+        <w:rPr>
+          <w:lang w:val="en-US"/>
+        </w:rPr>
+        <w:t>I</w:t>
+      </w:r>
+      <w:r>
+        <w:rPr>
+          <w:lang w:val="en-US"/>
+        </w:rPr>
+        <w:t>’m</w:t>
+      </w:r>
+      <w:r>
+        <w:rPr>
+          <w:lang w:val="en-US"/>
+        </w:rPr>
+        <w:t xml:space="preserve"> a Full Stack Developer working </w:t>
+      </w:r>
+      <w:r>
+        <w:rPr>
+          <w:lang w:val="en-US"/>
+        </w:rPr>
+        <w:t xml:space="preserve">with </w:t>
+      </w:r>
+      <w:r>
+        <w:rPr>
+          <w:lang w:val="en-US"/>
+        </w:rPr>
+        <w:t>DotNet</w:t>
+      </w:r>
+      <w:r>
+        <w:rPr>
+          <w:lang w:val="en-US"/>
+        </w:rPr>
+        <w:t>, ReactJS</w:t>
+      </w:r>
+      <w:r>
+        <w:rPr>
+          <w:lang w:val="en-US"/>
+        </w:rPr>
+        <w:t xml:space="preserve"> and </w:t>
+      </w:r>
+      <w:r>
+        <w:rPr>
+          <w:lang w:val="en-US"/>
+        </w:rPr>
+        <w:t>PostgreSQL/</w:t>
+      </w:r>
+      <w:r>
+        <w:rPr>
+          <w:lang w:val="en-US"/>
+        </w:rPr>
+        <w:t>Post</w:t>
+      </w:r>
+      <w:r>
+        <w:rPr>
+          <w:lang w:val="en-US"/>
+        </w:rPr>
+        <w:t>GIS</w:t>
+      </w:r>
+      <w:r>
+        <w:rPr>
+          <w:lang w:val="en-US"/>
+        </w:rPr>
+        <w:t>, and</w:t>
+      </w:r>
+      <w:r>
+        <w:rPr>
+          <w:lang w:val="en-US"/>
+        </w:rPr>
+        <w:t xml:space="preserve"> have strong interests in data </w:t>
+      </w:r>
+      <w:r>
+        <w:rPr>
+          <w:lang w:val="en-US"/>
+        </w:rPr>
+        <w:t>visualisation</w:t>
+      </w:r>
+      <w:r>
+        <w:rPr>
+          <w:lang w:val="en-US"/>
+        </w:rPr>
+        <w:t xml:space="preserve"> and communication. I also design and develop software for embedded devices for data acquisition.</w:t>
+      </w:r>
+    </w:p>
+    <w:p>
+      <w:r>
+        <w:rPr>
+          <w:lang w:val="en-US"/>
+        </w:rPr>
+        <w:t xml:space="preserve">If you would like to read a more in-depth story about me, </w:t>
+      </w:r>
+      <w:r>
+        <w:rPr>
+          <w:lang w:val="en-US"/>
+        </w:rPr>
+        <w:t>here’s</w:t>
+      </w:r>
+      <w:r>
+        <w:rPr>
+          <w:lang w:val="en-US"/>
+        </w:rPr>
+        <w:t xml:space="preserve"> an </w:t>
+      </w:r>
+      <w:hyperlink r:id="Rf2bd0840454a43a0">
+        <w:r>
+          <w:rPr>
+            <w:rStyle w:val="Hyperlink"/>
+            <w:lang w:val="en-US"/>
+          </w:rPr>
+          <w:t>article</w:t>
+        </w:r>
+      </w:hyperlink>
+      <w:r>
+        <w:rPr>
+          <w:lang w:val="en-US"/>
+        </w:rPr>
+        <w:t>.</w:t>
+      </w:r>
+    </w:p>
+    <w:p>
+      <w:pPr>
+        <w:pStyle w:val="Heading1"/>
+      </w:pPr>
+      <w:bookmarkStart w:name="experience" w:id="2"/>
+      <w:bookmarkEnd w:id="1"/>
+      <w:r>
+        <w:t>Experience</w:t>
+      </w:r>
+    </w:p>
+    <w:p>
+      <w:pPr>
+        <w:pStyle w:val="Heading2"/>
+      </w:pPr>
+      <w:bookmarkStart w:name="venari-ltd" w:id="3"/>
+    </w:p>
+    <w:p>
+      <w:pPr>
+        <w:pStyle w:val="Heading2"/>
+        <w:rPr>
+          <w:lang w:val="en-US"/>
+        </w:rPr>
+      </w:pPr>
+      <w:r>
+        <w:rPr>
+          <w:lang w:val="en-US"/>
+        </w:rPr>
+        <w:t>Lynker</w:t>
+      </w:r>
+      <w:r>
+        <w:rPr>
+          <w:lang w:val="en-US"/>
+        </w:rPr>
+        <w:t xml:space="preserve"> Analytics</w:t>
+      </w:r>
+    </w:p>
+    <w:p>
+      <w:pPr>
+        <w:pStyle w:val="Heading3"/>
+      </w:pPr>
+      <w:r>
+        <w:rPr/>
+        <w:t>Senior Software Developer</w:t>
+      </w:r>
+    </w:p>
+    <w:p>
+      <w:pPr>
+        <w:pStyle w:val="Heading4"/>
+      </w:pPr>
+      <w:r>
+        <w:rPr/>
+        <w:t>October 2024 – Present</w:t>
+      </w:r>
+      <w:r>
+        <w:br/>
+      </w:r>
+      <w:hyperlink r:id="R2b3ef2fcfa954608">
         <w:r>
           <w:rPr>
             <w:rStyle w:val="Hyperlink"/>
           </w:rPr>
-          <w:t>article</w:t>
+          <w:t>lynker-analytics.com</w:t>
         </w:r>
       </w:hyperlink>
-      <w:r>
+    </w:p>
+    <w:p>
+      <w:pPr>
+        <w:pStyle w:val="Placement"/>
+      </w:pPr>
+      <w:r>
+        <w:rPr/>
+        <w:t xml:space="preserve">Net Carbon Zero (Lead Developer, Architect, Sep 2025 - present) </w:t>
+      </w:r>
+    </w:p>
+    <w:p>
+      <w:pPr>
+        <w:pStyle w:val="Skills"/>
+        <w:rPr>
+          <w:i w:val="0"/>
+          <w:iCs w:val="0"/>
+          <w:lang w:val="en-US"/>
+        </w:rPr>
+      </w:pPr>
+      <w:r>
+        <w:rPr>
+          <w:i w:val="0"/>
+          <w:iCs w:val="0"/>
+          <w:lang w:val="en-US"/>
+        </w:rPr>
+        <w:t>C#, ReactJS, TypeScript, Shadcn/UI, PostgreSQL/PostGIS, AWS ECS, CI/CD, Terraform, Docker</w:t>
+      </w:r>
+    </w:p>
+    <w:p>
+      <w:pPr>
+        <w:pStyle w:val="BodyText"/>
+        <w:rPr>
+          <w:i w:val="0"/>
+          <w:iCs w:val="0"/>
+        </w:rPr>
+      </w:pPr>
+      <w:r>
+        <w:rPr>
+          <w:i w:val="0"/>
+          <w:iCs w:val="0"/>
+        </w:rPr>
+        <w:t>Architected and developed the Net Carbon Zero Dashboard for Prism and Silver Fern Farms.</w:t>
+      </w:r>
+    </w:p>
+    <w:p>
+      <w:pPr>
+        <w:pStyle w:val="BodyText"/>
+        <w:rPr>
+          <w:i w:val="0"/>
+          <w:iCs w:val="0"/>
+          <w:lang w:val="en-US"/>
+        </w:rPr>
+      </w:pPr>
+      <w:r>
+        <w:rPr>
+          <w:i w:val="0"/>
+          <w:iCs w:val="0"/>
+          <w:lang w:val="en-US"/>
+        </w:rPr>
+        <w:t xml:space="preserve">Streamlining </w:t>
+      </w:r>
+      <w:r>
+        <w:rPr>
+          <w:i w:val="0"/>
+          <w:iCs w:val="0"/>
+          <w:lang w:val="en-US"/>
+        </w:rPr>
+        <w:t>previous</w:t>
+      </w:r>
+      <w:r>
+        <w:rPr>
+          <w:i w:val="0"/>
+          <w:iCs w:val="0"/>
+          <w:lang w:val="en-US"/>
+        </w:rPr>
+        <w:t xml:space="preserve"> work done on the Carbon Commit project and developing a new customer Onboarding </w:t>
+      </w:r>
+      <w:r>
+        <w:rPr>
+          <w:i w:val="0"/>
+          <w:iCs w:val="0"/>
+          <w:lang w:val="en-US"/>
+        </w:rPr>
+        <w:t>tool and</w:t>
+      </w:r>
+      <w:r>
+        <w:rPr>
+          <w:i w:val="0"/>
+          <w:iCs w:val="0"/>
+          <w:lang w:val="en-US"/>
+        </w:rPr>
+        <w:t xml:space="preserve"> migrating parts of Carbon Commit to a new ReactJS/Typescript frontend with code-first database design.</w:t>
+      </w:r>
+      <w:r>
+        <w:rPr/>
+        <w:t xml:space="preserve"> </w:t>
+      </w:r>
+    </w:p>
+    <w:p>
+      <w:pPr>
+        <w:pStyle w:val="BodyText"/>
+        <w:rPr>
+          <w:i w:val="0"/>
+          <w:iCs w:val="0"/>
+        </w:rPr>
+      </w:pPr>
+    </w:p>
+    <w:p>
+      <w:pPr>
+        <w:pStyle w:val="Placement"/>
+        <w:rPr>
+          <w:i w:val="0"/>
+          <w:iCs w:val="0"/>
+        </w:rPr>
+      </w:pPr>
+      <w:r>
+        <w:rPr>
+          <w:i w:val="0"/>
+          <w:iCs w:val="0"/>
+        </w:rPr>
+        <w:t>EUDR (Lead Developer, Oct 2024 - present)</w:t>
+      </w:r>
+    </w:p>
+    <w:p>
+      <w:pPr>
+        <w:pStyle w:val="Skills"/>
+        <w:rPr>
+          <w:i w:val="0"/>
+          <w:iCs w:val="0"/>
+          <w:lang w:val="en-US"/>
+        </w:rPr>
+      </w:pPr>
+      <w:r>
+        <w:rPr>
+          <w:i w:val="0"/>
+          <w:iCs w:val="0"/>
+          <w:lang w:val="en-US"/>
+        </w:rPr>
+        <w:t>C#, ReactJS, TypeScript, PostgreSQL/PostGIS, AWS ECS, CI/CD, Terraform, Docker</w:t>
+      </w:r>
+    </w:p>
+    <w:p>
+      <w:pPr>
+        <w:pStyle w:val="BodyText"/>
+        <w:rPr>
+          <w:i w:val="0"/>
+          <w:iCs w:val="0"/>
+        </w:rPr>
+      </w:pPr>
+      <w:r>
+        <w:rPr>
+          <w:i w:val="0"/>
+          <w:iCs w:val="0"/>
+        </w:rPr>
+        <w:t>Developed the EUDR Compliance System for Prism and the Meat Industry Association of New Zealand.</w:t>
+      </w:r>
+    </w:p>
+    <w:p>
+      <w:pPr>
+        <w:pStyle w:val="BodyText"/>
+        <w:rPr>
+          <w:i w:val="0"/>
+          <w:iCs w:val="0"/>
+          <w:lang w:val="en-US"/>
+        </w:rPr>
+      </w:pPr>
+      <w:r>
+        <w:rPr>
+          <w:i w:val="0"/>
+          <w:iCs w:val="0"/>
+          <w:lang w:val="en-US"/>
+        </w:rPr>
+        <w:t xml:space="preserve">The system enables exporters to track land use and provide Due Diligence Statements to the European Union as part of the Regulation on Deforestation-free Products (EUDR) that comes into effect in December </w:t>
+      </w:r>
+      <w:r>
+        <w:rPr>
+          <w:i w:val="0"/>
+          <w:iCs w:val="0"/>
+          <w:lang w:val="en-US"/>
+        </w:rPr>
+        <w:t>2026</w:t>
+      </w:r>
+      <w:r>
+        <w:rPr>
+          <w:i w:val="0"/>
+          <w:iCs w:val="0"/>
+          <w:lang w:val="en-US"/>
+        </w:rPr>
         <w:t>.</w:t>
       </w:r>
     </w:p>
     <w:p>
       <w:pPr>
-        <w:pStyle w:val="Heading1"/>
-      </w:pPr>
-      <w:bookmarkStart w:id="2" w:name="experience"/>
-      <w:bookmarkEnd w:id="1"/>
-      <w:r>
-        <w:t>Experience</w:t>
+        <w:pStyle w:val="BodyText"/>
+        <w:rPr>
+          <w:i w:val="0"/>
+          <w:iCs w:val="0"/>
+          <w:lang w:val="en-US"/>
+        </w:rPr>
+      </w:pPr>
+    </w:p>
+    <w:p>
+      <w:pPr>
+        <w:pStyle w:val="Placement"/>
+        <w:rPr>
+          <w:i w:val="0"/>
+          <w:iCs w:val="0"/>
+        </w:rPr>
+      </w:pPr>
+      <w:r>
+        <w:rPr>
+          <w:i w:val="0"/>
+          <w:iCs w:val="0"/>
+        </w:rPr>
+        <w:t>Power My Farm (Lead Developer, Architect, Apr 2025 - present)</w:t>
+      </w:r>
+    </w:p>
+    <w:p>
+      <w:pPr>
+        <w:pStyle w:val="Skills"/>
+        <w:rPr>
+          <w:i w:val="0"/>
+          <w:iCs w:val="0"/>
+          <w:lang w:val="en-US"/>
+        </w:rPr>
+      </w:pPr>
+      <w:r>
+        <w:rPr>
+          <w:i w:val="0"/>
+          <w:iCs w:val="0"/>
+          <w:lang w:val="en-US"/>
+        </w:rPr>
+        <w:t xml:space="preserve">ReactJS, TypeScript, </w:t>
+      </w:r>
+      <w:r>
+        <w:rPr>
+          <w:i w:val="0"/>
+          <w:iCs w:val="0"/>
+          <w:lang w:val="en-US"/>
+        </w:rPr>
+        <w:t>Shadcn</w:t>
+      </w:r>
+      <w:r>
+        <w:rPr>
+          <w:i w:val="0"/>
+          <w:iCs w:val="0"/>
+          <w:lang w:val="en-US"/>
+        </w:rPr>
+        <w:t xml:space="preserve">/UI, </w:t>
+      </w:r>
+      <w:r>
+        <w:rPr>
+          <w:i w:val="0"/>
+          <w:iCs w:val="0"/>
+          <w:lang w:val="en-US"/>
+        </w:rPr>
+        <w:t>Geo</w:t>
+      </w:r>
+      <w:r>
+        <w:rPr>
+          <w:i w:val="0"/>
+          <w:iCs w:val="0"/>
+          <w:lang w:val="en-US"/>
+        </w:rPr>
+        <w:t>S</w:t>
+      </w:r>
+      <w:r>
+        <w:rPr>
+          <w:i w:val="0"/>
+          <w:iCs w:val="0"/>
+          <w:lang w:val="en-US"/>
+        </w:rPr>
+        <w:t>erver</w:t>
+      </w:r>
+      <w:r>
+        <w:rPr>
+          <w:i w:val="0"/>
+          <w:iCs w:val="0"/>
+          <w:lang w:val="en-US"/>
+        </w:rPr>
+        <w:t>, AWS ECS, CI/CD, Terraform</w:t>
+      </w:r>
+    </w:p>
+    <w:p>
+      <w:pPr>
+        <w:pStyle w:val="BodyText"/>
+        <w:rPr>
+          <w:i w:val="0"/>
+          <w:iCs w:val="0"/>
+        </w:rPr>
+      </w:pPr>
+      <w:r>
+        <w:rPr>
+          <w:i w:val="0"/>
+          <w:iCs w:val="0"/>
+        </w:rPr>
+        <w:t>Developed Power My Farm for Prism and ASB Bank, an easy-to-use online tool that enables Kiwi farmers to plan and assess solar energy systems tailored to their property.</w:t>
+      </w:r>
+    </w:p>
+    <w:p>
+      <w:pPr>
+        <w:pStyle w:val="BodyText"/>
+        <w:rPr>
+          <w:i w:val="0"/>
+          <w:iCs w:val="0"/>
+          <w:lang w:val="en-US"/>
+        </w:rPr>
+      </w:pPr>
+      <w:r>
+        <w:rPr>
+          <w:i w:val="0"/>
+          <w:iCs w:val="0"/>
+          <w:lang w:val="en-US"/>
+        </w:rPr>
+        <w:t xml:space="preserve">Consuming basemaps and insolation data from </w:t>
+      </w:r>
+      <w:r>
+        <w:rPr>
+          <w:i w:val="0"/>
+          <w:iCs w:val="0"/>
+          <w:lang w:val="en-US"/>
+        </w:rPr>
+        <w:t>Geo</w:t>
+      </w:r>
+      <w:r>
+        <w:rPr>
+          <w:i w:val="0"/>
+          <w:iCs w:val="0"/>
+          <w:lang w:val="en-US"/>
+        </w:rPr>
+        <w:t>S</w:t>
+      </w:r>
+      <w:r>
+        <w:rPr>
+          <w:i w:val="0"/>
+          <w:iCs w:val="0"/>
+          <w:lang w:val="en-US"/>
+        </w:rPr>
+        <w:t>erver</w:t>
+      </w:r>
+      <w:r>
+        <w:rPr>
+          <w:i w:val="0"/>
+          <w:iCs w:val="0"/>
+          <w:lang w:val="en-US"/>
+        </w:rPr>
+        <w:t xml:space="preserve">, this ReactJS/TypeScript application was designed to perform all energy and financial calculations on the </w:t>
+      </w:r>
+      <w:r>
+        <w:rPr>
+          <w:i w:val="0"/>
+          <w:iCs w:val="0"/>
+          <w:lang w:val="en-US"/>
+        </w:rPr>
+        <w:t>device,</w:t>
+      </w:r>
+      <w:r>
+        <w:rPr>
+          <w:i w:val="0"/>
+          <w:iCs w:val="0"/>
+          <w:lang w:val="en-US"/>
+        </w:rPr>
+        <w:t xml:space="preserve"> reducing any round-trip delays and improving user experience.</w:t>
+      </w:r>
+    </w:p>
+    <w:p>
+      <w:pPr>
+        <w:pStyle w:val="BodyText"/>
+        <w:rPr>
+          <w:i w:val="0"/>
+          <w:iCs w:val="0"/>
+        </w:rPr>
+      </w:pPr>
+    </w:p>
+    <w:p>
+      <w:pPr>
+        <w:pStyle w:val="Placement"/>
+        <w:rPr>
+          <w:i w:val="0"/>
+          <w:iCs w:val="0"/>
+        </w:rPr>
+      </w:pPr>
+      <w:r>
+        <w:rPr>
+          <w:i w:val="0"/>
+          <w:iCs w:val="0"/>
+        </w:rPr>
+        <w:t>Carbon Commit (Lead Developer, Oct 2024 - Aug 2025)</w:t>
+      </w:r>
+    </w:p>
+    <w:p>
+      <w:pPr>
+        <w:pStyle w:val="Skills"/>
+        <w:rPr>
+          <w:i w:val="0"/>
+          <w:iCs w:val="0"/>
+          <w:lang w:val="en-US"/>
+        </w:rPr>
+      </w:pPr>
+      <w:r>
+        <w:rPr>
+          <w:i w:val="0"/>
+          <w:iCs w:val="0"/>
+          <w:lang w:val="en-US"/>
+        </w:rPr>
+        <w:t>C#, LeafletJS, PostgreSQL/PostGIS, AWS ECS CI/CD Terraform Docker</w:t>
+      </w:r>
+    </w:p>
+    <w:p>
+      <w:pPr>
+        <w:pStyle w:val="BodyText"/>
+        <w:rPr>
+          <w:i w:val="0"/>
+          <w:iCs w:val="0"/>
+          <w:lang w:val="en-US"/>
+        </w:rPr>
+      </w:pPr>
+      <w:r>
+        <w:rPr>
+          <w:i w:val="0"/>
+          <w:iCs w:val="0"/>
+          <w:lang w:val="en-US"/>
+        </w:rPr>
+        <w:t xml:space="preserve">Ongoing support and enhancements to the </w:t>
+      </w:r>
+      <w:r>
+        <w:rPr>
+          <w:i w:val="0"/>
+          <w:iCs w:val="0"/>
+          <w:lang w:val="en-US"/>
+        </w:rPr>
+        <w:t>CarbonCommit</w:t>
+      </w:r>
+      <w:r>
+        <w:rPr>
+          <w:i w:val="0"/>
+          <w:iCs w:val="0"/>
+          <w:lang w:val="en-US"/>
+        </w:rPr>
+        <w:t xml:space="preserve"> geospatial data entry system, part of the Net Carbon Zero Mapping System for Silver Fern Farms and their suppliers and farmers to verify carbon credits as part of their Net Zero Carbon </w:t>
+      </w:r>
+      <w:r>
+        <w:rPr>
+          <w:i w:val="0"/>
+          <w:iCs w:val="0"/>
+          <w:lang w:val="en-US"/>
+        </w:rPr>
+        <w:t>programme</w:t>
+      </w:r>
+      <w:r>
+        <w:rPr>
+          <w:i w:val="0"/>
+          <w:iCs w:val="0"/>
+          <w:lang w:val="en-US"/>
+        </w:rPr>
+        <w:t>.</w:t>
       </w:r>
     </w:p>
     <w:p>
       <w:pPr>
         <w:pStyle w:val="Heading2"/>
       </w:pPr>
-      <w:bookmarkStart w:id="3" w:name="venari-ltd"/>
-    </w:p>
-    <w:p>
-      <w:pPr>
-        <w:pStyle w:val="Heading2"/>
-      </w:pPr>
-      <w:proofErr w:type="spellStart"/>
-      <w:r>
+      <w:r>
+        <w:rPr>
+          <w:lang w:val="en-US"/>
+        </w:rPr>
         <w:t>Venari</w:t>
       </w:r>
-      <w:proofErr w:type="spellEnd"/>
-      <w:r>
+      <w:r>
+        <w:rPr>
+          <w:lang w:val="en-US"/>
+        </w:rPr>
         <w:t xml:space="preserve"> Ltd</w:t>
       </w:r>
     </w:p>
@@ -276,20 +947,26 @@
     <w:p>
       <w:pPr>
         <w:pStyle w:val="Heading4"/>
-      </w:pPr>
-      <w:r>
+        <w:rPr>
+          <w:rStyle w:val="Hyperlink"/>
+        </w:rPr>
+      </w:pPr>
+      <w:r>
+        <w:rPr/>
         <w:t xml:space="preserve">November 2013 </w:t>
       </w:r>
       <w:r>
+        <w:rPr/>
         <w:t>–</w:t>
       </w:r>
       <w:r>
+        <w:rPr/>
         <w:t xml:space="preserve"> Present</w:t>
       </w:r>
       <w:r>
         <w:br/>
       </w:r>
-      <w:hyperlink r:id="rId11">
+      <w:hyperlink r:id="Rb17a0b9d58c743b8">
         <w:r>
           <w:rPr>
             <w:rStyle w:val="Hyperlink"/>
@@ -297,14 +974,23 @@
           <w:t>venari.co.nz</w:t>
         </w:r>
       </w:hyperlink>
-    </w:p>
-    <w:bookmarkEnd w:id="3"/>
+      <w:bookmarkEnd w:id="3"/>
+    </w:p>
     <w:p>
       <w:pPr>
         <w:pStyle w:val="Placement"/>
       </w:pPr>
       <w:r>
-        <w:t>Prism Earth (Lead Developer, Architect, Aug 2024 – Present)</w:t>
+        <w:rPr>
+          <w:lang w:val="en-US"/>
+        </w:rPr>
+        <w:t>Lynker</w:t>
+      </w:r>
+      <w:r>
+        <w:rPr>
+          <w:lang w:val="en-US"/>
+        </w:rPr>
+        <w:t xml:space="preserve"> Analytics and Zealandia Consulting (Architect and Developer, Feb 2023 – Jul 2024)</w:t>
       </w:r>
     </w:p>
     <w:p>
@@ -312,74 +998,439 @@
         <w:pStyle w:val="Skills"/>
       </w:pPr>
       <w:r>
-        <w:t xml:space="preserve">C#, </w:t>
-      </w:r>
-      <w:r>
-        <w:t xml:space="preserve">ReactJS, </w:t>
-      </w:r>
-      <w:r>
-        <w:t xml:space="preserve">TypeScript, </w:t>
-      </w:r>
-      <w:r>
-        <w:t>PostgreSQL</w:t>
-      </w:r>
-      <w:r>
-        <w:t>/</w:t>
-      </w:r>
-      <w:proofErr w:type="spellStart"/>
-      <w:r>
+        <w:t>C#, PostgreSQL, Python, Azure CI/CD, C</w:t>
+      </w:r>
+      <w:r>
+        <w:t>++</w:t>
+      </w:r>
+      <w:r>
+        <w:t>, Embedded</w:t>
+      </w:r>
+    </w:p>
+    <w:p>
+      <w:r>
+        <w:rPr>
+          <w:lang w:val="en-US"/>
+        </w:rPr>
+        <w:t xml:space="preserve">Developed and deployed several </w:t>
+      </w:r>
+      <w:r>
+        <w:rPr>
+          <w:lang w:val="en-US"/>
+        </w:rPr>
+        <w:t>Envirocam</w:t>
+      </w:r>
+      <w:r>
+        <w:rPr>
+          <w:lang w:val="en-US"/>
+        </w:rPr>
+        <w:t xml:space="preserve"> systems to </w:t>
+      </w:r>
+      <w:r>
+        <w:rPr>
+          <w:lang w:val="en-US"/>
+        </w:rPr>
+        <w:t>monitor</w:t>
+      </w:r>
+      <w:r>
+        <w:rPr>
+          <w:lang w:val="en-US"/>
+        </w:rPr>
+        <w:t xml:space="preserve"> several construction and industrial sites in Auckland. Two versions of the device were created, the first a Raspberry Pi Zero using Python, and a second Microcontroller based version using C++ with the aim of reducing power requirements and the costs of components.</w:t>
+      </w:r>
+    </w:p>
+    <w:p>
+      <w:r>
+        <w:rPr>
+          <w:lang w:val="en-US"/>
+        </w:rPr>
+        <w:t xml:space="preserve">Following the </w:t>
+      </w:r>
+      <w:r>
+        <w:rPr>
+          <w:lang w:val="en-US"/>
+        </w:rPr>
+        <w:t>initial</w:t>
+      </w:r>
+      <w:r>
+        <w:rPr>
+          <w:lang w:val="en-US"/>
+        </w:rPr>
+        <w:t xml:space="preserve"> 6-month development phase, I ran a 6-month fixed-price support contract for the cameras including servicing and </w:t>
+      </w:r>
+      <w:r>
+        <w:rPr>
+          <w:lang w:val="en-US"/>
+        </w:rPr>
+        <w:t>ongoing</w:t>
+      </w:r>
+      <w:r>
+        <w:rPr>
+          <w:lang w:val="en-US"/>
+        </w:rPr>
+        <w:t xml:space="preserve"> development.</w:t>
+      </w:r>
+    </w:p>
+    <w:p>
+      <w:pPr>
+        <w:pStyle w:val="Placement"/>
+      </w:pPr>
+      <w:r>
+        <w:rPr>
+          <w:lang w:val="en-US"/>
+        </w:rPr>
+        <w:t>Lynker</w:t>
+      </w:r>
+      <w:r>
+        <w:rPr>
+          <w:lang w:val="en-US"/>
+        </w:rPr>
+        <w:t xml:space="preserve"> Analytics (Lead Developer, Sep 2022 – Jul 2024)</w:t>
+      </w:r>
+    </w:p>
+    <w:p>
+      <w:pPr>
+        <w:pStyle w:val="Skills"/>
+        <w:rPr>
+          <w:lang w:val="en-US"/>
+        </w:rPr>
+      </w:pPr>
+      <w:r>
+        <w:rPr>
+          <w:lang w:val="en-US"/>
+        </w:rPr>
+        <w:t xml:space="preserve">C#, PostgreSQL, </w:t>
+      </w:r>
+      <w:r>
+        <w:rPr>
+          <w:lang w:val="en-US"/>
+        </w:rPr>
         <w:t>PostGIS</w:t>
       </w:r>
-      <w:proofErr w:type="spellEnd"/>
-      <w:r>
-        <w:t xml:space="preserve">, </w:t>
-      </w:r>
-      <w:r>
-        <w:t xml:space="preserve">AWS ECS, </w:t>
-      </w:r>
-      <w:r>
-        <w:t>CI/CD</w:t>
-      </w:r>
-      <w:r>
-        <w:t>, Terraform, Docker</w:t>
-      </w:r>
-    </w:p>
-    <w:p>
-      <w:pPr>
-        <w:pStyle w:val="BodyText"/>
-      </w:pPr>
-      <w:r>
-        <w:t>Developing key parts of the Land Use Compliance System for the Meat Industry Association.</w:t>
-      </w:r>
-    </w:p>
-    <w:p>
-      <w:pPr>
-        <w:pStyle w:val="BodyText"/>
-      </w:pPr>
-      <w:r>
-        <w:t>The system will enable exporters to track land use and provide Due Diligence Statements to the European Union as part of the Regulation on Deforestation-free Products (EUDR) that comes into effect in December 2024.</w:t>
-      </w:r>
-    </w:p>
-    <w:p>
-      <w:pPr>
-        <w:pStyle w:val="BodyText"/>
-      </w:pPr>
-      <w:r>
-        <w:rPr>
-          <w:i/>
-          <w:iCs/>
-        </w:rPr>
-        <w:t>More details soon.</w:t>
-      </w:r>
-    </w:p>
-    <w:p>
-      <w:pPr>
-        <w:rPr>
-          <w:b/>
-          <w:bCs/>
-        </w:rPr>
-      </w:pPr>
-      <w:r>
+      <w:r>
+        <w:rPr>
+          <w:lang w:val="en-US"/>
+        </w:rPr>
+        <w:t>, CI/CD, AWS</w:t>
+      </w:r>
+      <w:r>
+        <w:rPr>
+          <w:lang w:val="en-US"/>
+        </w:rPr>
+        <w:t xml:space="preserve"> ECS, Docker, </w:t>
+      </w:r>
+      <w:r>
+        <w:rPr>
+          <w:lang w:val="en-US"/>
+        </w:rPr>
+        <w:t>LeafletJS</w:t>
+      </w:r>
+    </w:p>
+    <w:p>
+      <w:r>
+        <w:rPr>
+          <w:lang w:val="en-US"/>
+        </w:rPr>
+        <w:t xml:space="preserve">Developed the </w:t>
+      </w:r>
+      <w:r>
+        <w:rPr>
+          <w:lang w:val="en-US"/>
+        </w:rPr>
+        <w:t>CarbonCommit</w:t>
+      </w:r>
+      <w:r>
+        <w:rPr>
+          <w:lang w:val="en-US"/>
+        </w:rPr>
+        <w:t xml:space="preserve"> geospatial data entry system, part of the Net Carbon Zero Mapping System for Silver Fern Farms and their suppliers and farmers to verify carbon credits as part of their Net Zero Carbon </w:t>
+      </w:r>
+      <w:r>
+        <w:rPr>
+          <w:lang w:val="en-US"/>
+        </w:rPr>
+        <w:t>programme</w:t>
+      </w:r>
+      <w:r>
+        <w:rPr>
+          <w:lang w:val="en-US"/>
+        </w:rPr>
+        <w:t xml:space="preserve">. In 2023 Silver Farm Farms &amp; </w:t>
+      </w:r>
+      <w:r>
+        <w:rPr>
+          <w:lang w:val="en-US"/>
+        </w:rPr>
+        <w:t>Lynker</w:t>
+      </w:r>
+      <w:r>
+        <w:rPr>
+          <w:lang w:val="en-US"/>
+        </w:rPr>
+        <w:t xml:space="preserve"> Analytics won the </w:t>
+      </w:r>
+      <w:r>
+        <w:rPr>
+          <w:lang w:val="en-US"/>
+        </w:rPr>
+        <w:t>Datamars</w:t>
+      </w:r>
+      <w:r>
+        <w:rPr>
+          <w:lang w:val="en-US"/>
+        </w:rPr>
+        <w:t xml:space="preserve"> Livestock Technology Award at the Beef and Lamb New Zealand Awards for The Net Carbon Zero Mapping System.</w:t>
+      </w:r>
+    </w:p>
+    <w:p>
+      <w:pPr>
+        <w:pStyle w:val="Placement"/>
+      </w:pPr>
+      <w:r>
+        <w:rPr>
+          <w:lang w:val="en-US"/>
+        </w:rPr>
+        <w:t>GasNet</w:t>
+      </w:r>
+      <w:r>
+        <w:rPr>
+          <w:lang w:val="en-US"/>
+        </w:rPr>
+        <w:t xml:space="preserve"> (Lead Developer, Architect</w:t>
+      </w:r>
+      <w:r>
+        <w:rPr>
+          <w:lang w:val="en-US"/>
+        </w:rPr>
+        <w:t>, Nov 2013 – May 2024</w:t>
+      </w:r>
+      <w:r>
+        <w:rPr>
+          <w:lang w:val="en-US"/>
+        </w:rPr>
+        <w:t>)</w:t>
+      </w:r>
+    </w:p>
+    <w:p>
+      <w:pPr>
+        <w:pStyle w:val="Skills"/>
+      </w:pPr>
+      <w:r>
+        <w:t>C#, PostgreSQL, Azure CI/CD</w:t>
+      </w:r>
+    </w:p>
+    <w:p>
+      <w:r>
+        <w:rPr>
+          <w:lang w:val="en-US"/>
+        </w:rPr>
+        <w:t xml:space="preserve">Developed a prototype for </w:t>
+      </w:r>
+      <w:r>
+        <w:rPr>
+          <w:lang w:val="en-US"/>
+        </w:rPr>
+        <w:t>GasNet’s</w:t>
+      </w:r>
+      <w:r>
+        <w:rPr>
+          <w:lang w:val="en-US"/>
+        </w:rPr>
+        <w:t xml:space="preserve"> MDMS Smart Meter Data Ingestion system. This trial system captures data from multiple manufacturers’ data </w:t>
+      </w:r>
+      <w:r>
+        <w:rPr>
+          <w:lang w:val="en-US"/>
+        </w:rPr>
+        <w:t>loggers and</w:t>
+      </w:r>
+      <w:r>
+        <w:rPr>
+          <w:lang w:val="en-US"/>
+        </w:rPr>
+        <w:t xml:space="preserve"> allows </w:t>
+      </w:r>
+      <w:r>
+        <w:rPr>
+          <w:lang w:val="en-US"/>
+        </w:rPr>
+        <w:t>GasNet</w:t>
+      </w:r>
+      <w:r>
+        <w:rPr>
+          <w:lang w:val="en-US"/>
+        </w:rPr>
+        <w:t xml:space="preserve"> to record and </w:t>
+      </w:r>
+      <w:r>
+        <w:rPr>
+          <w:lang w:val="en-US"/>
+        </w:rPr>
+        <w:t>analyse</w:t>
+      </w:r>
+      <w:r>
+        <w:rPr>
+          <w:lang w:val="en-US"/>
+        </w:rPr>
+        <w:t xml:space="preserve"> gas usage for their customers. Work has also been carried out to integrate MDMS with their legacy </w:t>
+      </w:r>
+      <w:r>
+        <w:rPr>
+          <w:lang w:val="en-US"/>
+        </w:rPr>
+        <w:t>MiDAS</w:t>
+      </w:r>
+      <w:r>
+        <w:rPr>
+          <w:lang w:val="en-US"/>
+        </w:rPr>
+        <w:t xml:space="preserve"> system.</w:t>
+      </w:r>
+    </w:p>
+    <w:p>
+      <w:r>
+        <w:rPr>
+          <w:lang w:val="en-US"/>
+        </w:rPr>
+        <w:t xml:space="preserve">Maintaining and enhancing </w:t>
+      </w:r>
+      <w:r>
+        <w:rPr>
+          <w:lang w:val="en-US"/>
+        </w:rPr>
+        <w:t>GasNet’s</w:t>
+      </w:r>
+      <w:r>
+        <w:rPr>
+          <w:lang w:val="en-US"/>
+        </w:rPr>
+        <w:t xml:space="preserve"> </w:t>
+      </w:r>
+      <w:r>
+        <w:rPr>
+          <w:lang w:val="en-US"/>
+        </w:rPr>
+        <w:t>MiDAS</w:t>
+      </w:r>
+      <w:r>
+        <w:rPr>
+          <w:lang w:val="en-US"/>
+        </w:rPr>
+        <w:t xml:space="preserve"> retailer billing system.</w:t>
+      </w:r>
+    </w:p>
+    <w:p>
+      <w:pPr>
+        <w:pStyle w:val="Placement"/>
+      </w:pPr>
+      <w:r>
+        <w:t>Northland Regional Council (Developer</w:t>
+      </w:r>
+      <w:r>
+        <w:t>, Feb – May 2024</w:t>
+      </w:r>
+      <w:r>
+        <w:t>)</w:t>
+      </w:r>
+    </w:p>
+    <w:p>
+      <w:pPr>
+        <w:pStyle w:val="Skills"/>
+      </w:pPr>
+      <w:r>
+        <w:t>C#, WSDL/SOAP, REST/JSON, TechOne, SQL Spatial</w:t>
+      </w:r>
+    </w:p>
+    <w:p>
+      <w:r>
+        <w:rPr>
+          <w:lang w:val="en-US"/>
+        </w:rPr>
+        <w:t xml:space="preserve">Further developed NRC’s TechOne Adaptor, a system that integrates IRIS (Integrated Regional Information System) with TechOne Finance, to port the integration to TechOne’s </w:t>
+      </w:r>
+      <w:r>
+        <w:rPr>
+          <w:lang w:val="en-US"/>
+        </w:rPr>
+        <w:t>CiAnywhere</w:t>
+      </w:r>
+      <w:r>
+        <w:rPr>
+          <w:lang w:val="en-US"/>
+        </w:rPr>
+        <w:t xml:space="preserve"> cloud-based service. Work involved moving parts of the system from a legacy WSDL/SOAP interface to their newer REST/JSON </w:t>
+      </w:r>
+      <w:r>
+        <w:rPr>
+          <w:lang w:val="en-US"/>
+        </w:rPr>
+        <w:t>interface and</w:t>
+      </w:r>
+      <w:r>
+        <w:rPr>
+          <w:lang w:val="en-US"/>
+        </w:rPr>
+        <w:t xml:space="preserve"> moving from </w:t>
+      </w:r>
+      <w:r>
+        <w:rPr>
+          <w:lang w:val="en-US"/>
+        </w:rPr>
+        <w:t>an old version</w:t>
+      </w:r>
+      <w:r>
+        <w:rPr>
+          <w:lang w:val="en-US"/>
+        </w:rPr>
+        <w:t xml:space="preserve"> of </w:t>
+      </w:r>
+      <w:r>
+        <w:rPr>
+          <w:lang w:val="en-US"/>
+        </w:rPr>
+        <w:t>DotNet</w:t>
+      </w:r>
+      <w:r>
+        <w:rPr>
+          <w:lang w:val="en-US"/>
+        </w:rPr>
+        <w:t xml:space="preserve"> Framework to a newer </w:t>
+      </w:r>
+      <w:r>
+        <w:rPr>
+          <w:lang w:val="en-US"/>
+        </w:rPr>
+        <w:t>DotNet</w:t>
+      </w:r>
+      <w:r>
+        <w:rPr>
+          <w:lang w:val="en-US"/>
+        </w:rPr>
+        <w:t xml:space="preserve"> Core code base.</w:t>
+      </w:r>
+    </w:p>
+    <w:p>
+      <w:pPr>
+        <w:rPr>
+          <w:lang w:val="en-US"/>
+        </w:rPr>
+      </w:pPr>
+      <w:r>
+        <w:rPr>
+          <w:lang w:val="en-US"/>
+        </w:rPr>
+        <w:t xml:space="preserve">Offered specialist knowledge in TechOne integration, and other </w:t>
+      </w:r>
+      <w:r>
+        <w:rPr>
+          <w:lang w:val="en-US"/>
+        </w:rPr>
+        <w:t>technologies.</w:t>
+      </w:r>
+      <w:r>
+        <w:rPr>
+          <w:lang w:val="en-US"/>
+        </w:rPr>
         <w:br w:type="page"/>
       </w:r>
     </w:p>
@@ -387,236 +1438,7 @@
       <w:pPr>
         <w:pStyle w:val="Placement"/>
       </w:pPr>
-      <w:proofErr w:type="spellStart"/>
-      <w:r>
-        <w:lastRenderedPageBreak/>
-        <w:t>Lynker</w:t>
-      </w:r>
-      <w:proofErr w:type="spellEnd"/>
-      <w:r>
-        <w:t xml:space="preserve"> Analytics and Zealandia Consulting (Architect and Developer, Feb 2023 – Jul 2024)</w:t>
-      </w:r>
-    </w:p>
-    <w:p>
-      <w:pPr>
-        <w:pStyle w:val="Skills"/>
-      </w:pPr>
-      <w:r>
-        <w:t>C#, PostgreSQL, Python, Azure CI/CD, C</w:t>
-      </w:r>
-      <w:r>
-        <w:t>++</w:t>
-      </w:r>
-      <w:r>
-        <w:t>, Embedded</w:t>
-      </w:r>
-    </w:p>
-    <w:p>
-      <w:r>
-        <w:t xml:space="preserve">Developed and deployed several </w:t>
-      </w:r>
-      <w:proofErr w:type="spellStart"/>
-      <w:r>
-        <w:t>Envirocam</w:t>
-      </w:r>
-      <w:proofErr w:type="spellEnd"/>
-      <w:r>
-        <w:t xml:space="preserve"> systems to monitor several construction and industrial sites in Auckland. Two versions of the device were created, the first a Raspberry Pi Zero using Python, and a second Microcontroller based version using C++ with the aim of reducing power requirements and the costs of components.</w:t>
-      </w:r>
-    </w:p>
-    <w:p>
-      <w:r>
-        <w:t>Following the initial 6-month development phase, I ran a 6-month fixed-price support contract for the cameras including servicing and on-going development.</w:t>
-      </w:r>
-    </w:p>
-    <w:p>
-      <w:pPr>
-        <w:pStyle w:val="Placement"/>
-      </w:pPr>
-      <w:proofErr w:type="spellStart"/>
-      <w:r>
-        <w:t>Lynker</w:t>
-      </w:r>
-      <w:proofErr w:type="spellEnd"/>
-      <w:r>
-        <w:t xml:space="preserve"> Analytics (Lead Developer, Sep 2022 – Jul 2024)</w:t>
-      </w:r>
-    </w:p>
-    <w:p>
-      <w:pPr>
-        <w:pStyle w:val="Skills"/>
-      </w:pPr>
-      <w:r>
-        <w:t xml:space="preserve">C#, PostgreSQL, </w:t>
-      </w:r>
-      <w:proofErr w:type="spellStart"/>
-      <w:r>
-        <w:t>PostGIS</w:t>
-      </w:r>
-      <w:proofErr w:type="spellEnd"/>
-      <w:r>
-        <w:t>, CI/CD, AWS</w:t>
-      </w:r>
-      <w:r>
-        <w:t xml:space="preserve"> ECS, Docker, </w:t>
-      </w:r>
-      <w:proofErr w:type="spellStart"/>
-      <w:r>
-        <w:t>LeafletJS</w:t>
-      </w:r>
-      <w:proofErr w:type="spellEnd"/>
-    </w:p>
-    <w:p>
-      <w:r>
-        <w:t xml:space="preserve">Developed the </w:t>
-      </w:r>
-      <w:proofErr w:type="spellStart"/>
-      <w:r>
-        <w:t>CarbonCommit</w:t>
-      </w:r>
-      <w:proofErr w:type="spellEnd"/>
-      <w:r>
-        <w:t xml:space="preserve"> geospatial data entry system, part of the Net Carbon Zero Mapping System for Silver Fern Farms and their suppliers and farmers to verify carbon credits as part of their Net Zero Carbon </w:t>
-      </w:r>
-      <w:proofErr w:type="spellStart"/>
-      <w:r>
-        <w:t>programme</w:t>
-      </w:r>
-      <w:proofErr w:type="spellEnd"/>
-      <w:r>
-        <w:t xml:space="preserve">. In 2023 Silver Farm Farms &amp; </w:t>
-      </w:r>
-      <w:proofErr w:type="spellStart"/>
-      <w:r>
-        <w:t>Lynker</w:t>
-      </w:r>
-      <w:proofErr w:type="spellEnd"/>
-      <w:r>
-        <w:t xml:space="preserve"> Analytics won the </w:t>
-      </w:r>
-      <w:proofErr w:type="spellStart"/>
-      <w:r>
-        <w:t>Datamars</w:t>
-      </w:r>
-      <w:proofErr w:type="spellEnd"/>
-      <w:r>
-        <w:t xml:space="preserve"> Livestock Technology Award at the Beef and Lamb New Zealand Awards for The Net Carbon Zero Mapping System.</w:t>
-      </w:r>
-    </w:p>
-    <w:p>
-      <w:pPr>
-        <w:pStyle w:val="Placement"/>
-      </w:pPr>
-      <w:proofErr w:type="spellStart"/>
-      <w:r>
-        <w:t>GasNet</w:t>
-      </w:r>
-      <w:proofErr w:type="spellEnd"/>
-      <w:r>
-        <w:t xml:space="preserve"> (Lead Developer, Architect</w:t>
-      </w:r>
-      <w:r>
-        <w:t>, Nov 2013 – May 2024</w:t>
-      </w:r>
-      <w:r>
-        <w:t>)</w:t>
-      </w:r>
-    </w:p>
-    <w:p>
-      <w:pPr>
-        <w:pStyle w:val="Skills"/>
-      </w:pPr>
-      <w:r>
-        <w:t>C#, PostgreSQL, Azure CI/CD</w:t>
-      </w:r>
-    </w:p>
-    <w:p>
-      <w:r>
-        <w:t xml:space="preserve">Developed a prototype for GasNet’s MDMS Smart Meter Data Ingestion system. This trial system captures data from multiple manufacturers’ data </w:t>
-      </w:r>
-      <w:r>
-        <w:t>loggers and</w:t>
-      </w:r>
-      <w:r>
-        <w:t xml:space="preserve"> allows </w:t>
-      </w:r>
-      <w:proofErr w:type="spellStart"/>
-      <w:r>
-        <w:t>GasNet</w:t>
-      </w:r>
-      <w:proofErr w:type="spellEnd"/>
-      <w:r>
-        <w:t xml:space="preserve"> to record and analyse gas usage for their customers. Work has also been carried out to integrate MDMS with their legacy MiDAS system.</w:t>
-      </w:r>
-    </w:p>
-    <w:p>
-      <w:r>
-        <w:t xml:space="preserve">Maintaining and enhancing </w:t>
-      </w:r>
-      <w:proofErr w:type="spellStart"/>
-      <w:r>
-        <w:t>GasNet’s</w:t>
-      </w:r>
-      <w:proofErr w:type="spellEnd"/>
-      <w:r>
-        <w:t xml:space="preserve"> </w:t>
-      </w:r>
-      <w:proofErr w:type="spellStart"/>
-      <w:r>
-        <w:t>MiDAS</w:t>
-      </w:r>
-      <w:proofErr w:type="spellEnd"/>
-      <w:r>
-        <w:t xml:space="preserve"> retailer billing system.</w:t>
-      </w:r>
-    </w:p>
-    <w:p>
-      <w:pPr>
-        <w:pStyle w:val="Placement"/>
-      </w:pPr>
-      <w:r>
-        <w:t>Northland Regional Council (Developer</w:t>
-      </w:r>
-      <w:r>
-        <w:t>, Feb – May 2024</w:t>
-      </w:r>
-      <w:r>
-        <w:t>)</w:t>
-      </w:r>
-    </w:p>
-    <w:p>
-      <w:pPr>
-        <w:pStyle w:val="Skills"/>
-      </w:pPr>
-      <w:r>
-        <w:t>C#, WSDL/SOAP, REST/JSON, TechOne, SQL Spatial</w:t>
-      </w:r>
-    </w:p>
-    <w:p>
-      <w:r>
-        <w:t xml:space="preserve">Further developed NRC’s TechOne Adaptor, a system that integrates IRIS (Integrated Regional Information System) with TechOne Finance, to port the integration to TechOne’s CiAnywhere cloud-based service. Work involved moving parts of the system from a legacy WSDL/SOAP interface to their newer REST/JSON </w:t>
-      </w:r>
-      <w:r>
-        <w:t>interface and</w:t>
-      </w:r>
-      <w:r>
-        <w:t xml:space="preserve"> moving from an old version of DotNet Framework to a newer DotNet Core code base.</w:t>
-      </w:r>
-    </w:p>
-    <w:p>
-      <w:r>
-        <w:t>Offered specialist knowledge in TechOne integration, and other technologies.</w:t>
-      </w:r>
-      <w:r>
-        <w:br w:type="page"/>
-      </w:r>
-    </w:p>
-    <w:p>
-      <w:pPr>
-        <w:pStyle w:val="Placement"/>
-      </w:pPr>
-      <w:r>
-        <w:lastRenderedPageBreak/>
+      <w:r>
         <w:t>Manulife Investment Management Timberland and Agriculture Inc (formally HNRG) (Lead Developer</w:t>
       </w:r>
       <w:r>
@@ -697,8 +1519,14 @@
           <w:ilvl w:val="0"/>
           <w:numId w:val="6"/>
         </w:numPr>
-      </w:pPr>
-      <w:r>
+        <w:rPr>
+          <w:lang w:val="en-US"/>
+        </w:rPr>
+      </w:pPr>
+      <w:r>
+        <w:rPr>
+          <w:lang w:val="en-US"/>
+        </w:rPr>
         <w:t>Transpower</w:t>
       </w:r>
     </w:p>
@@ -742,16 +1570,85 @@
       <w:pPr>
         <w:pStyle w:val="Placement"/>
       </w:pPr>
+      <w:r>
+        <w:rPr>
+          <w:lang w:val="en-US"/>
+        </w:rPr>
+        <w:t>BureauCo</w:t>
+      </w:r>
+      <w:r>
+        <w:rPr>
+          <w:lang w:val="en-US"/>
+        </w:rPr>
+        <w:t xml:space="preserve"> (Lead Developer</w:t>
+      </w:r>
+      <w:r>
+        <w:rPr>
+          <w:lang w:val="en-US"/>
+        </w:rPr>
+        <w:t>, Nov 2013 – May 2015</w:t>
+      </w:r>
+      <w:r>
+        <w:rPr>
+          <w:lang w:val="en-US"/>
+        </w:rPr>
+        <w:t>)</w:t>
+      </w:r>
+    </w:p>
+    <w:p>
+      <w:pPr>
+        <w:pStyle w:val="Skills"/>
+      </w:pPr>
+      <w:r>
+        <w:t>C#, ArcGIS, Silverlight</w:t>
+      </w:r>
+    </w:p>
+    <w:p>
+      <w:r>
+        <w:rPr>
+          <w:lang w:val="en-US"/>
+        </w:rPr>
+        <w:t xml:space="preserve">Maintained and enhanced </w:t>
+      </w:r>
+      <w:r>
+        <w:rPr>
+          <w:lang w:val="en-US"/>
+        </w:rPr>
+        <w:t>BureauCo’s</w:t>
+      </w:r>
+      <w:r>
+        <w:rPr>
+          <w:lang w:val="en-US"/>
+        </w:rPr>
+        <w:t xml:space="preserve"> </w:t>
+      </w:r>
+      <w:r>
+        <w:rPr>
+          <w:lang w:val="en-US"/>
+        </w:rPr>
+        <w:t>Plan.IT.Road</w:t>
+      </w:r>
+      <w:r>
+        <w:rPr>
+          <w:lang w:val="en-US"/>
+        </w:rPr>
+        <w:t xml:space="preserve"> system</w:t>
+      </w:r>
+    </w:p>
+    <w:p>
+      <w:pPr>
+        <w:pStyle w:val="Placement"/>
+      </w:pPr>
       <w:proofErr w:type="spellStart"/>
       <w:r>
-        <w:t>BureauCo</w:t>
+        <w:t>Astara</w:t>
       </w:r>
       <w:proofErr w:type="spellEnd"/>
       <w:r>
-        <w:t xml:space="preserve"> (Lead Developer</w:t>
-      </w:r>
-      <w:r>
-        <w:t>, Nov 2013 – May 2015</w:t>
+        <w:t xml:space="preserve"> Technologies (Lead Developer</w:t>
+      </w:r>
+      <w:r>
+        <w:t>, 2015, 2017, 2019</w:t>
       </w:r>
       <w:r>
         <w:t>)</w:t>
@@ -762,47 +1659,74 @@
         <w:pStyle w:val="Skills"/>
       </w:pPr>
       <w:r>
-        <w:t>C#, ArcGIS, Silverlight</w:t>
-      </w:r>
-    </w:p>
-    <w:p>
-      <w:r>
-        <w:t xml:space="preserve">Maintained and enhanced </w:t>
-      </w:r>
-      <w:proofErr w:type="spellStart"/>
-      <w:r>
-        <w:t>BureauCo’s</w:t>
-      </w:r>
-      <w:proofErr w:type="spellEnd"/>
-      <w:r>
+        <w:t>NodeJS, AngularJS, Embedded, Docker</w:t>
+      </w:r>
+    </w:p>
+    <w:p>
+      <w:r>
+        <w:rPr>
+          <w:lang w:val="en-US"/>
+        </w:rPr>
+        <w:t>A series of short engagements,</w:t>
+      </w:r>
+      <w:r>
+        <w:rPr>
+          <w:lang w:val="en-US"/>
+        </w:rPr>
+        <w:t xml:space="preserve"> supported and </w:t>
+      </w:r>
+      <w:r>
+        <w:rPr>
+          <w:lang w:val="en-US"/>
+        </w:rPr>
+        <w:t>Dockerised</w:t>
+      </w:r>
+      <w:r>
+        <w:rPr>
+          <w:lang w:val="en-US"/>
+        </w:rPr>
         <w:t xml:space="preserve"> </w:t>
       </w:r>
-      <w:proofErr w:type="spellStart"/>
-      <w:r>
-        <w:t>Plan.IT.Road</w:t>
-      </w:r>
-      <w:proofErr w:type="spellEnd"/>
-      <w:r>
-        <w:t xml:space="preserve"> system</w:t>
+      <w:r>
+        <w:rPr>
+          <w:lang w:val="en-US"/>
+        </w:rPr>
+        <w:t>Astara’s</w:t>
+      </w:r>
+      <w:r>
+        <w:rPr>
+          <w:lang w:val="en-US"/>
+        </w:rPr>
+        <w:t xml:space="preserve"> embedded Battery Management System </w:t>
+      </w:r>
+      <w:r>
+        <w:rPr>
+          <w:lang w:val="en-US"/>
+        </w:rPr>
+        <w:t>visualisation</w:t>
+      </w:r>
+      <w:r>
+        <w:rPr>
+          <w:lang w:val="en-US"/>
+        </w:rPr>
+        <w:t xml:space="preserve"> software.</w:t>
       </w:r>
     </w:p>
     <w:p>
       <w:pPr>
         <w:pStyle w:val="Placement"/>
       </w:pPr>
-      <w:proofErr w:type="spellStart"/>
-      <w:r>
-        <w:t>Astara</w:t>
-      </w:r>
-      <w:proofErr w:type="spellEnd"/>
-      <w:r>
-        <w:t xml:space="preserve"> Technologies (Lead Developer</w:t>
-      </w:r>
-      <w:r>
-        <w:t>, 2015, 2017, 2019</w:t>
-      </w:r>
-      <w:r>
-        <w:t>)</w:t>
+      <w:r>
+        <w:rPr>
+          <w:lang w:val="en-US"/>
+        </w:rPr>
+        <w:t>Whirinaki</w:t>
+      </w:r>
+      <w:r>
+        <w:rPr>
+          <w:lang w:val="en-US"/>
+        </w:rPr>
+        <w:t xml:space="preserve"> Whare Taonga (Lead Developer, Support)</w:t>
       </w:r>
     </w:p>
     <w:p>
@@ -810,90 +1734,50 @@
         <w:pStyle w:val="Skills"/>
       </w:pPr>
       <w:r>
-        <w:t>NodeJS, AngularJS, Embedded, Docker</w:t>
-      </w:r>
-    </w:p>
-    <w:p>
-      <w:proofErr w:type="gramStart"/>
-      <w:r>
-        <w:t>A series of short engagements,</w:t>
-      </w:r>
-      <w:proofErr w:type="gramEnd"/>
-      <w:r>
-        <w:t xml:space="preserve"> supported and </w:t>
-      </w:r>
-      <w:proofErr w:type="spellStart"/>
-      <w:r>
-        <w:t>Dockerised</w:t>
-      </w:r>
-      <w:proofErr w:type="spellEnd"/>
-      <w:r>
-        <w:t xml:space="preserve"> </w:t>
-      </w:r>
-      <w:proofErr w:type="spellStart"/>
-      <w:r>
-        <w:t>Astara’s</w:t>
-      </w:r>
-      <w:proofErr w:type="spellEnd"/>
-      <w:r>
-        <w:t xml:space="preserve"> embedded Battery Management System </w:t>
-      </w:r>
-      <w:proofErr w:type="spellStart"/>
-      <w:r>
-        <w:t>visualisation</w:t>
-      </w:r>
-      <w:proofErr w:type="spellEnd"/>
-      <w:r>
-        <w:t xml:space="preserve"> software.</w:t>
-      </w:r>
-    </w:p>
-    <w:p>
-      <w:pPr>
-        <w:pStyle w:val="Placement"/>
-      </w:pPr>
-      <w:proofErr w:type="spellStart"/>
-      <w:r>
-        <w:t>Whirinaki</w:t>
-      </w:r>
-      <w:proofErr w:type="spellEnd"/>
-      <w:r>
-        <w:t xml:space="preserve"> Whare Taonga (Lead Developer, Support)</w:t>
-      </w:r>
-    </w:p>
-    <w:p>
-      <w:pPr>
-        <w:pStyle w:val="Skills"/>
-      </w:pPr>
-      <w:proofErr w:type="spellStart"/>
-      <w:r>
+        <w:rPr>
+          <w:lang w:val="en-US"/>
+        </w:rPr>
         <w:t>Silverstripe</w:t>
       </w:r>
-      <w:proofErr w:type="spellEnd"/>
-      <w:r>
+      <w:r>
+        <w:rPr>
+          <w:lang w:val="en-US"/>
+        </w:rPr>
         <w:t>, JavaScript</w:t>
       </w:r>
     </w:p>
     <w:p>
       <w:r>
+        <w:rPr>
+          <w:lang w:val="en-US"/>
+        </w:rPr>
         <w:t xml:space="preserve">Maintained and updated </w:t>
       </w:r>
-      <w:proofErr w:type="spellStart"/>
-      <w:r>
+      <w:r>
+        <w:rPr>
+          <w:lang w:val="en-US"/>
+        </w:rPr>
         <w:t>Whirinaki’s</w:t>
       </w:r>
-      <w:proofErr w:type="spellEnd"/>
-      <w:r>
+      <w:r>
+        <w:rPr>
+          <w:lang w:val="en-US"/>
+        </w:rPr>
         <w:t xml:space="preserve"> website, including updating to latest version of </w:t>
       </w:r>
-      <w:proofErr w:type="spellStart"/>
-      <w:r>
+      <w:r>
+        <w:rPr>
+          <w:lang w:val="en-US"/>
+        </w:rPr>
         <w:t>Silverstripe</w:t>
       </w:r>
-      <w:proofErr w:type="spellEnd"/>
-      <w:r>
+      <w:r>
+        <w:rPr>
+          <w:lang w:val="en-US"/>
+        </w:rPr>
         <w:t>, and rebrand in 2022.</w:t>
       </w:r>
-      <w:bookmarkStart w:id="4" w:name="splice-group-ltd"/>
+      <w:bookmarkStart w:name="splice-group-ltd" w:id="4"/>
     </w:p>
     <w:p>
       <w:pPr>
@@ -915,7 +1799,6 @@
         <w:pStyle w:val="Heading2"/>
       </w:pPr>
       <w:r>
-        <w:lastRenderedPageBreak/>
         <w:t>Splice Group Ltd</w:t>
       </w:r>
     </w:p>
@@ -984,15 +1867,46 @@
     </w:p>
     <w:p>
       <w:r>
+        <w:rPr>
+          <w:lang w:val="en-US"/>
+        </w:rPr>
         <w:t xml:space="preserve">Integrated NRC’s TechOne finance system with the cross-regional Integrated Regional Information System, enabling data </w:t>
       </w:r>
-      <w:proofErr w:type="gramStart"/>
-      <w:r>
+      <w:r>
+        <w:rPr>
+          <w:lang w:val="en-US"/>
+        </w:rPr>
         <w:t>entered into</w:t>
       </w:r>
-      <w:proofErr w:type="gramEnd"/>
-      <w:r>
-        <w:t xml:space="preserve"> IRIS to be synchronised with TechOne. Implemented a WCF service that published WSDL interface consumed by IRIS, and in turn wrote data to TechOne using its web service.</w:t>
+      <w:r>
+        <w:rPr>
+          <w:lang w:val="en-US"/>
+        </w:rPr>
+        <w:t xml:space="preserve"> IRIS to be </w:t>
+      </w:r>
+      <w:r>
+        <w:rPr>
+          <w:lang w:val="en-US"/>
+        </w:rPr>
+        <w:t>synchronised</w:t>
+      </w:r>
+      <w:r>
+        <w:rPr>
+          <w:lang w:val="en-US"/>
+        </w:rPr>
+        <w:t xml:space="preserve"> with TechOne. Implemented a WCF service that published </w:t>
+      </w:r>
+      <w:r>
+        <w:rPr>
+          <w:lang w:val="en-US"/>
+        </w:rPr>
+        <w:t>WSDL</w:t>
+      </w:r>
+      <w:r>
+        <w:rPr>
+          <w:lang w:val="en-US"/>
+        </w:rPr>
+        <w:t xml:space="preserve"> interface consumed by IRIS, and in turn wrote data to TechOne using its web service.</w:t>
       </w:r>
     </w:p>
     <w:p>
@@ -1011,33 +1925,223 @@
         <w:pStyle w:val="Skills"/>
       </w:pPr>
       <w:r>
+        <w:rPr>
+          <w:lang w:val="en-US"/>
+        </w:rPr>
         <w:t xml:space="preserve">C#, </w:t>
       </w:r>
+      <w:r>
+        <w:rPr>
+          <w:lang w:val="en-US"/>
+        </w:rPr>
+        <w:t>ServiceStack</w:t>
+      </w:r>
+      <w:r>
+        <w:rPr>
+          <w:lang w:val="en-US"/>
+        </w:rPr>
+        <w:t>, ArcGIS</w:t>
+      </w:r>
+    </w:p>
+    <w:p>
+      <w:r>
+        <w:t>Sub-contracted to Eagle Technology Ltd to develop an unexploded ordnance clearance request application. Developed using Service Stack, SQL Server and ArcGIS, the application enabled users to request land near oil fields in Iraq to be cleared of UXO. The application used the ArcGIS JavaScript API, Bootstrap, and dual-factor authentication.</w:t>
+      </w:r>
+    </w:p>
+    <w:p>
+      <w:pPr>
+        <w:pStyle w:val="Placement"/>
+      </w:pPr>
+      <w:r>
+        <w:rPr>
+          <w:lang w:val="en-US"/>
+        </w:rPr>
+        <w:t>BureauCo</w:t>
+      </w:r>
+      <w:r>
+        <w:rPr>
+          <w:lang w:val="en-US"/>
+        </w:rPr>
+        <w:t xml:space="preserve"> (Analyst/Developer)</w:t>
+      </w:r>
+    </w:p>
+    <w:p>
+      <w:pPr>
+        <w:pStyle w:val="Skills"/>
+      </w:pPr>
+      <w:r>
+        <w:t>C#, Silverlight, ArcGIS</w:t>
+      </w:r>
+    </w:p>
+    <w:p>
+      <w:r>
+        <w:rPr>
+          <w:lang w:val="en-US"/>
+        </w:rPr>
+        <w:t xml:space="preserve">Migrated </w:t>
+      </w:r>
+      <w:r>
+        <w:rPr>
+          <w:lang w:val="en-US"/>
+        </w:rPr>
+        <w:t>PLAN.IT.road</w:t>
+      </w:r>
+      <w:r>
+        <w:rPr>
+          <w:lang w:val="en-US"/>
+        </w:rPr>
+        <w:t xml:space="preserve"> roading corridor management application from </w:t>
+      </w:r>
+      <w:r>
+        <w:rPr>
+          <w:lang w:val="en-US"/>
+        </w:rPr>
+        <w:t>ArcIMS</w:t>
+      </w:r>
+      <w:r>
+        <w:rPr>
+          <w:lang w:val="en-US"/>
+        </w:rPr>
+        <w:t xml:space="preserve"> to ArcGIS and Silverlight. Made several enhancements and stability improvements to the application, including enabling support for The National Code of Practice for Utility Operators’ Access to Transport Corridors.</w:t>
+      </w:r>
+    </w:p>
+    <w:p>
+      <w:pPr>
+        <w:pStyle w:val="Placement"/>
+      </w:pPr>
+      <w:r>
+        <w:t>Hutt City Council, Selwyn District Council, Kapiti District Council, Upper Hutt City Council (Analyst/Developer)</w:t>
+      </w:r>
+    </w:p>
+    <w:p>
+      <w:pPr>
+        <w:pStyle w:val="Skills"/>
+      </w:pPr>
+      <w:r>
+        <w:t>C#, ArcGIS</w:t>
+      </w:r>
+    </w:p>
+    <w:p>
+      <w:r>
+        <w:rPr>
+          <w:lang w:val="en-US"/>
+        </w:rPr>
+        <w:t xml:space="preserve">Developed Splice Group’s LIM application, streamlining councils’ manual LIM processes by automating retrieval of data from geospatial and finance systems, and generating final output. Integrated with ArcGIS, </w:t>
+      </w:r>
+      <w:r>
+        <w:rPr>
+          <w:lang w:val="en-US"/>
+        </w:rPr>
+        <w:t>TechnologyOne</w:t>
+      </w:r>
+      <w:r>
+        <w:rPr>
+          <w:lang w:val="en-US"/>
+        </w:rPr>
+        <w:t xml:space="preserve"> (</w:t>
+      </w:r>
+      <w:r>
+        <w:rPr>
+          <w:lang w:val="en-US"/>
+        </w:rPr>
+        <w:t>PropertyCI</w:t>
+      </w:r>
+      <w:r>
+        <w:rPr>
+          <w:lang w:val="en-US"/>
+        </w:rPr>
+        <w:t>), and NCS.</w:t>
+      </w:r>
+    </w:p>
+    <w:p>
+      <w:pPr>
+        <w:pStyle w:val="Placement"/>
+      </w:pPr>
       <w:proofErr w:type="spellStart"/>
       <w:r>
-        <w:t>ServiceStack</w:t>
+        <w:t>Astara</w:t>
       </w:r>
       <w:proofErr w:type="spellEnd"/>
       <w:r>
-        <w:t>, ArcGIS</w:t>
-      </w:r>
-    </w:p>
-    <w:p>
-      <w:r>
-        <w:t>Sub-contracted to Eagle Technology Ltd to develop an unexploded ordnance clearance request application. Developed using Service Stack, SQL Server and ArcGIS, the application enabled users to request land near oil fields in Iraq to be cleared of UXO. The application used the ArcGIS JavaScript API, Bootstrap, and dual-factor authentication.</w:t>
+        <w:t xml:space="preserve"> Technologies (Developer)</w:t>
+      </w:r>
+    </w:p>
+    <w:p>
+      <w:pPr>
+        <w:pStyle w:val="Skills"/>
+      </w:pPr>
+      <w:r>
+        <w:t>NodeJS, Embedded</w:t>
+      </w:r>
+    </w:p>
+    <w:p>
+      <w:r>
+        <w:rPr>
+          <w:lang w:val="en-US"/>
+        </w:rPr>
+        <w:t>Astara</w:t>
+      </w:r>
+      <w:r>
+        <w:rPr>
+          <w:lang w:val="en-US"/>
+        </w:rPr>
+        <w:t xml:space="preserve"> Technologies developed battery management systems (BMS</w:t>
+      </w:r>
+      <w:r>
+        <w:rPr>
+          <w:lang w:val="en-US"/>
+        </w:rPr>
+        <w:t>) and</w:t>
+      </w:r>
+      <w:r>
+        <w:rPr>
+          <w:lang w:val="en-US"/>
+        </w:rPr>
+        <w:t xml:space="preserve"> needed to </w:t>
+      </w:r>
+      <w:r>
+        <w:rPr>
+          <w:lang w:val="en-US"/>
+        </w:rPr>
+        <w:t>visualise</w:t>
+      </w:r>
+      <w:r>
+        <w:rPr>
+          <w:lang w:val="en-US"/>
+        </w:rPr>
+        <w:t xml:space="preserve"> the data recorded by two electric motorbikes. The Energy Management Dashboard took data from the BMS, integrated GPS and video feed, and eased analysis by displaying a </w:t>
+      </w:r>
+      <w:r>
+        <w:rPr>
+          <w:lang w:val="en-US"/>
+        </w:rPr>
+        <w:t>sychronised</w:t>
+      </w:r>
+      <w:r>
+        <w:rPr>
+          <w:lang w:val="en-US"/>
+        </w:rPr>
+        <w:t xml:space="preserve"> video feed, map and graphs </w:t>
+      </w:r>
+      <w:r>
+        <w:rPr>
+          <w:lang w:val="en-US"/>
+        </w:rPr>
+        <w:t>representing</w:t>
+      </w:r>
+      <w:r>
+        <w:rPr>
+          <w:lang w:val="en-US"/>
+        </w:rPr>
+        <w:t xml:space="preserve"> battery performance.</w:t>
       </w:r>
     </w:p>
     <w:p>
       <w:pPr>
         <w:pStyle w:val="Placement"/>
       </w:pPr>
-      <w:proofErr w:type="spellStart"/>
-      <w:r>
-        <w:t>BureauCo</w:t>
-      </w:r>
-      <w:proofErr w:type="spellEnd"/>
-      <w:r>
-        <w:t xml:space="preserve"> (Analyst/Developer)</w:t>
+      <w:r>
+        <w:t>Wellington City Council (Analyst/Developer)</w:t>
       </w:r>
     </w:p>
     <w:p>
@@ -1045,20 +2149,68 @@
         <w:pStyle w:val="Skills"/>
       </w:pPr>
       <w:r>
-        <w:t>C#, Silverlight, ArcGIS</w:t>
-      </w:r>
-    </w:p>
-    <w:p>
-      <w:r>
-        <w:t xml:space="preserve">Migrated </w:t>
-      </w:r>
-      <w:proofErr w:type="spellStart"/>
-      <w:r>
-        <w:t>PLAN.IT.road</w:t>
-      </w:r>
-      <w:proofErr w:type="spellEnd"/>
-      <w:r>
-        <w:t xml:space="preserve"> roading corridor management application from ArcIMS to ArcGIS and Silverlight. Made several enhancements and stability improvements to the application, including enabling support for The National Code of Practice for Utility Operators’ Access to Transport Corridors.</w:t>
+        <w:t>ArcGIS, JavaScript</w:t>
+      </w:r>
+    </w:p>
+    <w:p>
+      <w:pPr>
+        <w:rPr>
+          <w:lang w:val="en-US"/>
+        </w:rPr>
+      </w:pPr>
+      <w:r>
+        <w:rPr>
+          <w:lang w:val="en-US"/>
+        </w:rPr>
+        <w:t xml:space="preserve">Sub-contracted to Eagle Technology Ltd, undertook an independent Architecture Review for WCC’s internal CityView application, a legacy Java/ArcGIS/JavaScript system which was experiencing </w:t>
+      </w:r>
+      <w:r>
+        <w:rPr>
+          <w:lang w:val="en-US"/>
+        </w:rPr>
+        <w:t>a number of</w:t>
+      </w:r>
+      <w:r>
+        <w:rPr>
+          <w:lang w:val="en-US"/>
+        </w:rPr>
+        <w:t xml:space="preserve"> performance issues.</w:t>
+      </w:r>
+      <w:r>
+        <w:rPr>
+          <w:lang w:val="en-US"/>
+        </w:rPr>
+        <w:t xml:space="preserve"> </w:t>
+      </w:r>
+      <w:r>
+        <w:rPr>
+          <w:lang w:val="en-US"/>
+        </w:rPr>
+        <w:t xml:space="preserve">Produced a report with </w:t>
+      </w:r>
+      <w:r>
+        <w:rPr>
+          <w:lang w:val="en-US"/>
+        </w:rPr>
+        <w:t>a number of</w:t>
+      </w:r>
+      <w:r>
+        <w:rPr>
+          <w:lang w:val="en-US"/>
+        </w:rPr>
+        <w:t xml:space="preserve"> </w:t>
+      </w:r>
+      <w:r>
+        <w:rPr>
+          <w:lang w:val="en-US"/>
+        </w:rPr>
+        <w:t>recommendations and</w:t>
+      </w:r>
+      <w:r>
+        <w:rPr>
+          <w:lang w:val="en-US"/>
+        </w:rPr>
+        <w:t xml:space="preserve"> helped WCC implement some of those recommendations.</w:t>
       </w:r>
     </w:p>
     <w:p>
@@ -1066,7 +2218,16 @@
         <w:pStyle w:val="Placement"/>
       </w:pPr>
       <w:r>
-        <w:t>Hutt City Council, Selwyn District Council, Kapiti District Council, Upper Hutt City Council (Analyst/Developer)</w:t>
+        <w:rPr>
+          <w:lang w:val="en-US"/>
+        </w:rPr>
+        <w:t>GasNet</w:t>
+      </w:r>
+      <w:r>
+        <w:rPr>
+          <w:lang w:val="en-US"/>
+        </w:rPr>
+        <w:t xml:space="preserve"> (Developer)</w:t>
       </w:r>
     </w:p>
     <w:p>
@@ -1074,114 +2235,228 @@
         <w:pStyle w:val="Skills"/>
       </w:pPr>
       <w:r>
-        <w:t>C#, ArcGIS</w:t>
-      </w:r>
-    </w:p>
-    <w:p>
-      <w:r>
-        <w:t>Developed Splice Group’s LIM application, streamlining councils’ manual LIM processes by automating retrieval of data from geospatial and finance systems, and generating final output. Integrated with ArcGIS, TechnologyOne (PropertyCI), and NCS.</w:t>
+        <w:t>C#, SQL</w:t>
+      </w:r>
+    </w:p>
+    <w:p>
+      <w:r>
+        <w:rPr>
+          <w:lang w:val="en-US"/>
+        </w:rPr>
+        <w:t xml:space="preserve">Took over support and maintenance of </w:t>
+      </w:r>
+      <w:r>
+        <w:rPr>
+          <w:lang w:val="en-US"/>
+        </w:rPr>
+        <w:t>GasNet’s</w:t>
+      </w:r>
+      <w:r>
+        <w:rPr>
+          <w:lang w:val="en-US"/>
+        </w:rPr>
+        <w:t xml:space="preserve"> retailer billing system, developing enhancements to support legislative changes to the gas industry in New Zealand.</w:t>
       </w:r>
     </w:p>
     <w:p>
       <w:pPr>
         <w:pStyle w:val="Placement"/>
       </w:pPr>
-      <w:proofErr w:type="spellStart"/>
-      <w:r>
-        <w:t>Astara</w:t>
-      </w:r>
-      <w:proofErr w:type="spellEnd"/>
-      <w:r>
-        <w:t xml:space="preserve"> Technologies (Developer)</w:t>
+      <w:r>
+        <w:t>Auckland City Council (Analyst/Developer)</w:t>
       </w:r>
     </w:p>
     <w:p>
       <w:pPr>
         <w:pStyle w:val="Skills"/>
-      </w:pPr>
-      <w:r>
-        <w:t>NodeJS, Embedded</w:t>
-      </w:r>
-    </w:p>
-    <w:p>
-      <w:proofErr w:type="spellStart"/>
-      <w:r>
-        <w:t>Astara</w:t>
-      </w:r>
-      <w:proofErr w:type="spellEnd"/>
-      <w:r>
-        <w:t xml:space="preserve"> Technologies developed battery management systems (BMS</w:t>
-      </w:r>
-      <w:r>
-        <w:t>) and</w:t>
-      </w:r>
-      <w:r>
-        <w:t xml:space="preserve"> needed to </w:t>
-      </w:r>
-      <w:proofErr w:type="spellStart"/>
-      <w:r>
-        <w:t>visualise</w:t>
-      </w:r>
-      <w:proofErr w:type="spellEnd"/>
-      <w:r>
-        <w:t xml:space="preserve"> the data recorded by two electric motorbikes. The Energy Management Dashboard took data from the BMS, integrated GPS and video feed, and eased analysis by displaying a sychronised video feed, map and graphs representing battery performance.</w:t>
-      </w:r>
-    </w:p>
+        <w:rPr>
+          <w:lang w:val="en-US"/>
+        </w:rPr>
+      </w:pPr>
+      <w:r>
+        <w:rPr>
+          <w:lang w:val="en-US"/>
+        </w:rPr>
+        <w:t xml:space="preserve">C#, ArcGIS </w:t>
+      </w:r>
+      <w:r>
+        <w:rPr>
+          <w:lang w:val="en-US"/>
+        </w:rPr>
+        <w:t>ArcObjects</w:t>
+      </w:r>
+    </w:p>
+    <w:p>
+      <w:r>
+        <w:rPr>
+          <w:lang w:val="en-US"/>
+        </w:rPr>
+        <w:t xml:space="preserve">Implemented </w:t>
+      </w:r>
+      <w:r>
+        <w:rPr>
+          <w:lang w:val="en-US"/>
+        </w:rPr>
+        <w:t>customisations</w:t>
+      </w:r>
+      <w:r>
+        <w:rPr>
+          <w:lang w:val="en-US"/>
+        </w:rPr>
+        <w:t xml:space="preserve"> to ArcGIS to enable ACC’s legacy </w:t>
+      </w:r>
+      <w:r>
+        <w:rPr>
+          <w:lang w:val="en-US"/>
+        </w:rPr>
+        <w:t>smallworld</w:t>
+      </w:r>
+      <w:r>
+        <w:rPr>
+          <w:lang w:val="en-US"/>
+        </w:rPr>
+        <w:t xml:space="preserve"> application to be migrated to Esri ArcGIS. Also implemented an ETL </w:t>
+      </w:r>
+      <w:r>
+        <w:rPr>
+          <w:lang w:val="en-US"/>
+        </w:rPr>
+        <w:t>component</w:t>
+      </w:r>
+      <w:r>
+        <w:rPr>
+          <w:lang w:val="en-US"/>
+        </w:rPr>
+        <w:t xml:space="preserve"> that allowed FME to </w:t>
+      </w:r>
+      <w:r>
+        <w:rPr>
+          <w:lang w:val="en-US"/>
+        </w:rPr>
+        <w:t>synchronise</w:t>
+      </w:r>
+      <w:r>
+        <w:rPr>
+          <w:lang w:val="en-US"/>
+        </w:rPr>
+        <w:t xml:space="preserve"> the data between the two different systems.</w:t>
+      </w:r>
+    </w:p>
+    <w:p>
+      <w:pPr>
+        <w:pStyle w:val="Heading2"/>
+      </w:pPr>
+      <w:bookmarkStart w:name="explorer-graphics-ltd" w:id="5"/>
+    </w:p>
+    <w:p>
+      <w:pPr>
+        <w:pStyle w:val="Heading2"/>
+      </w:pPr>
+      <w:r>
+        <w:t>Explorer Graphics Ltd</w:t>
+      </w:r>
+    </w:p>
+    <w:p>
+      <w:pPr>
+        <w:pStyle w:val="Heading3"/>
+      </w:pPr>
+      <w:r>
+        <w:t>Senior GIS Developer</w:t>
+      </w:r>
+    </w:p>
+    <w:p>
+      <w:pPr>
+        <w:pStyle w:val="Heading4"/>
+      </w:pPr>
+      <w:r>
+        <w:t>2008 - 2010</w:t>
+      </w:r>
+    </w:p>
+    <w:bookmarkEnd w:id="5"/>
     <w:p>
       <w:pPr>
         <w:pStyle w:val="Placement"/>
       </w:pPr>
       <w:r>
-        <w:lastRenderedPageBreak/>
-        <w:t>Wellington City Council (Analyst/Developer)</w:t>
+        <w:rPr>
+          <w:lang w:val="en-US"/>
+        </w:rPr>
+        <w:t>XPLview</w:t>
+      </w:r>
+      <w:r>
+        <w:rPr>
+          <w:lang w:val="en-US"/>
+        </w:rPr>
+        <w:t xml:space="preserve"> (Team Leader, Developer)</w:t>
       </w:r>
     </w:p>
     <w:p>
       <w:pPr>
         <w:pStyle w:val="Skills"/>
-      </w:pPr>
-      <w:r>
-        <w:t>ArcGIS, JavaScript</w:t>
-      </w:r>
-    </w:p>
-    <w:p>
-      <w:r>
-        <w:t xml:space="preserve">Sub-contracted to Eagle Technology Ltd, undertook an independent Architecture Review for WCC’s internal CityView application, a legacy Java/ArcGIS/JavaScript system which was experiencing </w:t>
-      </w:r>
-      <w:proofErr w:type="gramStart"/>
-      <w:r>
-        <w:t>a number of</w:t>
-      </w:r>
-      <w:proofErr w:type="gramEnd"/>
-      <w:r>
-        <w:t xml:space="preserve"> performance issues. Produced a report with </w:t>
-      </w:r>
-      <w:proofErr w:type="gramStart"/>
-      <w:r>
-        <w:t>a number of</w:t>
-      </w:r>
-      <w:proofErr w:type="gramEnd"/>
-      <w:r>
-        <w:t xml:space="preserve"> </w:t>
-      </w:r>
-      <w:r>
-        <w:t>recommendations and</w:t>
-      </w:r>
-      <w:r>
-        <w:t xml:space="preserve"> helped WCC implement some of those recommendations.</w:t>
+        <w:rPr>
+          <w:lang w:val="en-US"/>
+        </w:rPr>
+      </w:pPr>
+      <w:r>
+        <w:rPr>
+          <w:lang w:val="en-US"/>
+        </w:rPr>
+        <w:t xml:space="preserve">C#, JavaScript, ArcGIS, </w:t>
+      </w:r>
+      <w:r>
+        <w:rPr>
+          <w:lang w:val="en-US"/>
+        </w:rPr>
+        <w:t>ArcIMS</w:t>
+      </w:r>
+    </w:p>
+    <w:p>
+      <w:r>
+        <w:rPr>
+          <w:lang w:val="en-US"/>
+        </w:rPr>
+        <w:t xml:space="preserve">Led a team developing EGL’s </w:t>
+      </w:r>
+      <w:r>
+        <w:rPr>
+          <w:lang w:val="en-US"/>
+        </w:rPr>
+        <w:t>XPLview</w:t>
+      </w:r>
+      <w:r>
+        <w:rPr>
+          <w:lang w:val="en-US"/>
+        </w:rPr>
+        <w:t xml:space="preserve"> application, which enabled councils to expose their </w:t>
+      </w:r>
+      <w:r>
+        <w:rPr>
+          <w:lang w:val="en-US"/>
+        </w:rPr>
+        <w:t>ArcIMS</w:t>
+      </w:r>
+      <w:r>
+        <w:rPr>
+          <w:lang w:val="en-US"/>
+        </w:rPr>
+        <w:t xml:space="preserve"> and ArcGIS servers, integrated with financial and property systems, as public facing web applications.</w:t>
       </w:r>
     </w:p>
     <w:p>
       <w:pPr>
         <w:pStyle w:val="Placement"/>
       </w:pPr>
-      <w:proofErr w:type="spellStart"/>
-      <w:r>
-        <w:t>GasNet</w:t>
-      </w:r>
-      <w:proofErr w:type="spellEnd"/>
-      <w:r>
-        <w:t xml:space="preserve"> (Developer)</w:t>
+      <w:r>
+        <w:rPr>
+          <w:lang w:val="en-US"/>
+        </w:rPr>
+        <w:t>SurveyLab</w:t>
+      </w:r>
+      <w:r>
+        <w:rPr>
+          <w:lang w:val="en-US"/>
+        </w:rPr>
+        <w:t xml:space="preserve"> Ike (Developer)</w:t>
       </w:r>
     </w:p>
     <w:p>
@@ -1189,161 +2464,67 @@
         <w:pStyle w:val="Skills"/>
       </w:pPr>
       <w:r>
-        <w:t>C#, SQL</w:t>
-      </w:r>
-    </w:p>
-    <w:p>
-      <w:r>
-        <w:t>Took over support and maintenance of GasNet’s retailer billing system, developing enhancements to support legislative changes to the gas industry in New Zealand.</w:t>
-      </w:r>
-    </w:p>
-    <w:p>
-      <w:pPr>
-        <w:pStyle w:val="Placement"/>
-      </w:pPr>
-      <w:r>
-        <w:t>Auckland City Council (Analyst/Developer)</w:t>
-      </w:r>
-    </w:p>
-    <w:p>
-      <w:pPr>
-        <w:pStyle w:val="Skills"/>
-      </w:pPr>
-      <w:r>
-        <w:t xml:space="preserve">C#, ArcGIS </w:t>
-      </w:r>
-      <w:proofErr w:type="spellStart"/>
-      <w:r>
-        <w:t>ArcObjects</w:t>
-      </w:r>
-      <w:proofErr w:type="spellEnd"/>
-    </w:p>
-    <w:p>
-      <w:r>
+        <w:rPr>
+          <w:lang w:val="en-US"/>
+        </w:rPr>
+        <w:t>ArcPad</w:t>
+      </w:r>
+      <w:r>
+        <w:rPr>
+          <w:lang w:val="en-US"/>
+        </w:rPr>
+        <w:t>, ArcGIS, VB Script</w:t>
+      </w:r>
+    </w:p>
+    <w:p>
+      <w:pPr>
+        <w:rPr>
+          <w:i w:val="1"/>
+          <w:iCs w:val="1"/>
+          <w:lang w:val="en-US"/>
+        </w:rPr>
+      </w:pPr>
+      <w:r>
+        <w:rPr>
+          <w:lang w:val="en-US"/>
+        </w:rPr>
         <w:t xml:space="preserve">Implemented </w:t>
       </w:r>
-      <w:proofErr w:type="spellStart"/>
-      <w:r>
+      <w:r>
+        <w:rPr>
+          <w:lang w:val="en-US"/>
+        </w:rPr>
         <w:t>customisations</w:t>
       </w:r>
-      <w:proofErr w:type="spellEnd"/>
-      <w:r>
-        <w:t xml:space="preserve"> to ArcGIS to enable ACC’s legacy smallworld application to be migrated to Esri ArcGIS. Also implemented an ETL component that allowed FME to synchronise the data between the two different systems.</w:t>
-      </w:r>
-    </w:p>
-    <w:p>
-      <w:pPr>
-        <w:pStyle w:val="Heading2"/>
-      </w:pPr>
-      <w:bookmarkStart w:id="5" w:name="explorer-graphics-ltd"/>
-    </w:p>
-    <w:p>
-      <w:pPr>
-        <w:pStyle w:val="Heading2"/>
-      </w:pPr>
-      <w:r>
-        <w:t>Explorer Graphics Ltd</w:t>
-      </w:r>
-    </w:p>
-    <w:p>
-      <w:pPr>
-        <w:pStyle w:val="Heading3"/>
-      </w:pPr>
-      <w:r>
-        <w:t>Senior GIS Developer</w:t>
-      </w:r>
-    </w:p>
-    <w:p>
-      <w:pPr>
-        <w:pStyle w:val="Heading4"/>
-      </w:pPr>
-      <w:r>
-        <w:t>2008 - 2010</w:t>
-      </w:r>
-    </w:p>
-    <w:bookmarkEnd w:id="5"/>
-    <w:p>
-      <w:pPr>
-        <w:pStyle w:val="Placement"/>
-      </w:pPr>
-      <w:proofErr w:type="spellStart"/>
-      <w:r>
-        <w:t>XPLview</w:t>
-      </w:r>
-      <w:proofErr w:type="spellEnd"/>
-      <w:r>
-        <w:t xml:space="preserve"> (Team Leader, Developer)</w:t>
-      </w:r>
-    </w:p>
-    <w:p>
-      <w:pPr>
-        <w:pStyle w:val="Skills"/>
-      </w:pPr>
-      <w:r>
-        <w:t xml:space="preserve">C#, JavaScript, ArcGIS, </w:t>
-      </w:r>
-      <w:proofErr w:type="spellStart"/>
-      <w:r>
-        <w:t>ArcIMS</w:t>
-      </w:r>
-      <w:proofErr w:type="spellEnd"/>
-    </w:p>
-    <w:p>
-      <w:r>
-        <w:t>Led a team developing EGL’s XPLview application, which enabled councils to expose their ArcIMS and ArcGIS servers, integrated with financial and property systems, as public facing web applications.</w:t>
-      </w:r>
-    </w:p>
-    <w:p>
-      <w:pPr>
-        <w:pStyle w:val="Placement"/>
-      </w:pPr>
-      <w:proofErr w:type="spellStart"/>
-      <w:r>
-        <w:t>SurveyLab</w:t>
-      </w:r>
-      <w:proofErr w:type="spellEnd"/>
-      <w:r>
-        <w:t xml:space="preserve"> Ike (Developer)</w:t>
-      </w:r>
-    </w:p>
-    <w:p>
-      <w:pPr>
-        <w:pStyle w:val="Skills"/>
-      </w:pPr>
-      <w:proofErr w:type="spellStart"/>
-      <w:r>
+      <w:r>
+        <w:rPr>
+          <w:lang w:val="en-US"/>
+        </w:rPr>
+        <w:t xml:space="preserve"> to </w:t>
+      </w:r>
+      <w:r>
+        <w:rPr>
+          <w:lang w:val="en-US"/>
+        </w:rPr>
         <w:t>ArcPad</w:t>
       </w:r>
-      <w:proofErr w:type="spellEnd"/>
-      <w:r>
-        <w:t>, ArcGIS, VB Script</w:t>
-      </w:r>
-    </w:p>
-    <w:p>
-      <w:pPr>
-        <w:rPr>
-          <w:i/>
-          <w:iCs/>
-        </w:rPr>
-      </w:pPr>
-      <w:r>
-        <w:t xml:space="preserve">Implemented </w:t>
-      </w:r>
-      <w:proofErr w:type="spellStart"/>
-      <w:r>
-        <w:t>customisations</w:t>
-      </w:r>
-      <w:proofErr w:type="spellEnd"/>
-      <w:r>
-        <w:t xml:space="preserve"> to </w:t>
-      </w:r>
-      <w:proofErr w:type="spellStart"/>
-      <w:r>
-        <w:t>ArcPad</w:t>
-      </w:r>
-      <w:proofErr w:type="spellEnd"/>
-      <w:r>
-        <w:t xml:space="preserve"> to allow users to quickly record information during surveys, including cemetery headstones and water service infrastructure. Data could then be synchronised into ArcGIS for further analysis.</w:t>
+      <w:r>
+        <w:rPr>
+          <w:lang w:val="en-US"/>
+        </w:rPr>
+        <w:t xml:space="preserve"> to allow users to quickly record information during surveys, including cemetery headstones and water service infrastructure. Data could then be </w:t>
+      </w:r>
+      <w:r>
+        <w:rPr>
+          <w:lang w:val="en-US"/>
+        </w:rPr>
+        <w:t>synchronised</w:t>
+      </w:r>
+      <w:r>
+        <w:rPr>
+          <w:lang w:val="en-US"/>
+        </w:rPr>
+        <w:t xml:space="preserve"> into ArcGIS for further analysis.</w:t>
       </w:r>
     </w:p>
     <w:p>
@@ -1357,7 +2538,7 @@
           <w:szCs w:val="28"/>
         </w:rPr>
       </w:pPr>
-      <w:bookmarkStart w:id="6" w:name="swordfish-business-solutions-uk"/>
+      <w:bookmarkStart w:name="swordfish-business-solutions-uk" w:id="6"/>
       <w:r>
         <w:br w:type="page"/>
       </w:r>
@@ -1410,7 +2591,34 @@
     </w:p>
     <w:p>
       <w:r>
-        <w:t>Worked in London Finance office, supporting “FirmControl” and Generic Reporting applications, used to monitor the financial performance of this £780m firm.</w:t>
+        <w:rPr>
+          <w:lang w:val="en-US"/>
+        </w:rPr>
+        <w:t>Worked in London Finance office, supporting “</w:t>
+      </w:r>
+      <w:r>
+        <w:rPr>
+          <w:lang w:val="en-US"/>
+        </w:rPr>
+        <w:t>FirmControl</w:t>
+      </w:r>
+      <w:r>
+        <w:rPr>
+          <w:lang w:val="en-US"/>
+        </w:rPr>
+        <w:t xml:space="preserve">” and Generic Reporting applications, used to </w:t>
+      </w:r>
+      <w:r>
+        <w:rPr>
+          <w:lang w:val="en-US"/>
+        </w:rPr>
+        <w:t>monitor</w:t>
+      </w:r>
+      <w:r>
+        <w:rPr>
+          <w:lang w:val="en-US"/>
+        </w:rPr>
+        <w:t xml:space="preserve"> the financial performance of this £780m firm.</w:t>
       </w:r>
     </w:p>
     <w:p>
@@ -1431,7 +2639,22 @@
     </w:p>
     <w:p>
       <w:r>
-        <w:t>Subcontracted to KA Technology, developed a Document Assembly Module for KA Technology’s legal sector client and integrated with a Document Management System.</w:t>
+        <w:rPr>
+          <w:lang w:val="en-US"/>
+        </w:rPr>
+        <w:t xml:space="preserve">Subcontracted to KA Technology, developed a Document Assembly Module for KA Technology’s legal sector </w:t>
+      </w:r>
+      <w:r>
+        <w:rPr>
+          <w:lang w:val="en-US"/>
+        </w:rPr>
+        <w:t>client</w:t>
+      </w:r>
+      <w:r>
+        <w:rPr>
+          <w:lang w:val="en-US"/>
+        </w:rPr>
+        <w:t xml:space="preserve"> and integrated with a Document Management System.</w:t>
       </w:r>
     </w:p>
     <w:p>
@@ -1459,7 +2682,7 @@
       <w:pPr>
         <w:pStyle w:val="Heading2"/>
       </w:pPr>
-      <w:bookmarkStart w:id="7" w:name="atkins-management-consultants-uk"/>
+      <w:bookmarkStart w:name="atkins-management-consultants-uk" w:id="7"/>
     </w:p>
     <w:p>
       <w:pPr>
@@ -1493,7 +2716,7 @@
       <w:r>
         <w:br/>
       </w:r>
-      <w:hyperlink r:id="rId12" w:history="1">
+      <w:hyperlink w:history="1" r:id="rId12">
         <w:r>
           <w:rPr>
             <w:rStyle w:val="Hyperlink"/>
@@ -1543,9 +2766,25 @@
           <w:ilvl w:val="0"/>
           <w:numId w:val="8"/>
         </w:numPr>
-      </w:pPr>
-      <w:r>
-        <w:t>Integrated the contact management system with the organisation’s document management and production system.</w:t>
+        <w:rPr/>
+      </w:pPr>
+      <w:r>
+        <w:rPr>
+          <w:lang w:val="en-US"/>
+        </w:rPr>
+        <w:t xml:space="preserve">Integrated the contact management system with the </w:t>
+      </w:r>
+      <w:r>
+        <w:rPr>
+          <w:lang w:val="en-US"/>
+        </w:rPr>
+        <w:t>organisation’s</w:t>
+      </w:r>
+      <w:r>
+        <w:rPr>
+          <w:lang w:val="en-US"/>
+        </w:rPr>
+        <w:t xml:space="preserve"> document management and production system.</w:t>
       </w:r>
     </w:p>
     <w:p>
@@ -1555,9 +2794,25 @@
           <w:ilvl w:val="0"/>
           <w:numId w:val="8"/>
         </w:numPr>
-      </w:pPr>
-      <w:r>
-        <w:t>Supported internal development of a database recording accessibility issues at rail stations, and reporting KPIs.</w:t>
+        <w:rPr/>
+      </w:pPr>
+      <w:r>
+        <w:rPr>
+          <w:lang w:val="en-US"/>
+        </w:rPr>
+        <w:t xml:space="preserve">Supported internal development of a database </w:t>
+      </w:r>
+      <w:r>
+        <w:rPr>
+          <w:lang w:val="en-US"/>
+        </w:rPr>
+        <w:t>recording</w:t>
+      </w:r>
+      <w:r>
+        <w:rPr>
+          <w:lang w:val="en-US"/>
+        </w:rPr>
+        <w:t xml:space="preserve"> accessibility issues at rail stations, and reporting KPIs.</w:t>
       </w:r>
     </w:p>
     <w:p>
@@ -1588,7 +2843,6 @@
         <w:pStyle w:val="Placement"/>
       </w:pPr>
       <w:r>
-        <w:lastRenderedPageBreak/>
         <w:t>British Airports Authority (Business Analyst)</w:t>
       </w:r>
     </w:p>
@@ -1602,13 +2856,46 @@
     </w:p>
     <w:p>
       <w:r>
+        <w:rPr>
+          <w:lang w:val="en-US"/>
+        </w:rPr>
         <w:t xml:space="preserve">Business Analyst for BAA’s 600+ user, mission critical, Staff Information System at Heathrow and Stansted. Performed stakeholder </w:t>
       </w:r>
       <w:r>
+        <w:rPr>
+          <w:lang w:val="en-US"/>
+        </w:rPr>
         <w:t>analysis and</w:t>
       </w:r>
       <w:r>
-        <w:t xml:space="preserve"> led workshops and interviews with key airside and landside users from 28 internal departments and external organisations, gathering business requirements for the replacement system. At the end of this £1M+ project’s feasibility phase, I formed part of the supplier selection panel. Later produced the Site Acceptance Test plan for the installation of the Automated Public Announcement System at terminals 1-4.</w:t>
+        <w:rPr>
+          <w:lang w:val="en-US"/>
+        </w:rPr>
+        <w:t xml:space="preserve"> led workshops and interviews with key airside and landside users from 28 internal departments and external </w:t>
+      </w:r>
+      <w:r>
+        <w:rPr>
+          <w:lang w:val="en-US"/>
+        </w:rPr>
+        <w:t>organisations</w:t>
+      </w:r>
+      <w:r>
+        <w:rPr>
+          <w:lang w:val="en-US"/>
+        </w:rPr>
+        <w:t xml:space="preserve">, gathering business requirements for the replacement system. At the end of this £1M+ project’s feasibility phase, I formed part of the supplier selection panel. </w:t>
+      </w:r>
+      <w:r>
+        <w:rPr>
+          <w:lang w:val="en-US"/>
+        </w:rPr>
+        <w:t>Later produced</w:t>
+      </w:r>
+      <w:r>
+        <w:rPr>
+          <w:lang w:val="en-US"/>
+        </w:rPr>
+        <w:t xml:space="preserve"> the Site Acceptance Test plan for the installation of the Automated Public Announcement System at terminals 1-4.</w:t>
       </w:r>
     </w:p>
     <w:p>
@@ -1650,7 +2937,22 @@
     </w:p>
     <w:p>
       <w:r>
-        <w:t>Enhanced and developed The National Archives Document Ordering System (DORIS), and document import system (DUPION). Captured requirements for a space management system, to help TNA staff to manage the document repositories (currently spanning over 100 miles of shelving).</w:t>
+        <w:rPr>
+          <w:lang w:val="en-US"/>
+        </w:rPr>
+        <w:t xml:space="preserve">Enhanced and developed The National Archives Document Ordering System (DORIS), and document import system (DUPION). Captured requirements for a space management system, to help TNA </w:t>
+      </w:r>
+      <w:r>
+        <w:rPr>
+          <w:lang w:val="en-US"/>
+        </w:rPr>
+        <w:t>staff to</w:t>
+      </w:r>
+      <w:r>
+        <w:rPr>
+          <w:lang w:val="en-US"/>
+        </w:rPr>
+        <w:t xml:space="preserve"> manage the document repositories (currently spanning over 100 miles of shelving).</w:t>
       </w:r>
     </w:p>
     <w:p>
@@ -1671,7 +2973,34 @@
     </w:p>
     <w:p>
       <w:r>
-        <w:t>Designed, developed and led a team of four developers for FSA’s Nutrient Databank application for collating and calculating food nutritional information.</w:t>
+        <w:rPr>
+          <w:lang w:val="en-US"/>
+        </w:rPr>
+        <w:t xml:space="preserve">Designed, </w:t>
+      </w:r>
+      <w:r>
+        <w:rPr>
+          <w:lang w:val="en-US"/>
+        </w:rPr>
+        <w:t>developed</w:t>
+      </w:r>
+      <w:r>
+        <w:rPr>
+          <w:lang w:val="en-US"/>
+        </w:rPr>
+        <w:t xml:space="preserve"> and </w:t>
+      </w:r>
+      <w:r>
+        <w:rPr>
+          <w:lang w:val="en-US"/>
+        </w:rPr>
+        <w:t>led</w:t>
+      </w:r>
+      <w:r>
+        <w:rPr>
+          <w:lang w:val="en-US"/>
+        </w:rPr>
+        <w:t xml:space="preserve"> a team of four developers for FSA’s Nutrient Databank application for collating and calculating food nutritional information.</w:t>
       </w:r>
     </w:p>
     <w:p>
@@ -1720,7 +3049,7 @@
       <w:pPr>
         <w:pStyle w:val="Heading2"/>
       </w:pPr>
-      <w:bookmarkStart w:id="8" w:name="financial-planning-software-ltd-uk"/>
+      <w:bookmarkStart w:name="financial-planning-software-ltd-uk" w:id="8"/>
     </w:p>
     <w:p>
       <w:pPr>
@@ -1757,7 +3086,22 @@
     </w:p>
     <w:p>
       <w:r>
-        <w:t>Part of a small team that designed, implemented and tested the new Windows version of the company’s DOS based financial planning software suite. The project was developed using Visual C++ and OOD methods to produce flexible and maintainable code.</w:t>
+        <w:rPr>
+          <w:lang w:val="en-US"/>
+        </w:rPr>
+        <w:t xml:space="preserve">Part of a small team that designed, </w:t>
+      </w:r>
+      <w:r>
+        <w:rPr>
+          <w:lang w:val="en-US"/>
+        </w:rPr>
+        <w:t>implemented</w:t>
+      </w:r>
+      <w:r>
+        <w:rPr>
+          <w:lang w:val="en-US"/>
+        </w:rPr>
+        <w:t xml:space="preserve"> and tested the new Windows version of the company’s DOS based financial planning software suite. The project was developed using Visual C++ and OOD methods to produce flexible and maintainable code.</w:t>
       </w:r>
     </w:p>
     <w:p>
@@ -1770,7 +3114,7 @@
           <w:szCs w:val="32"/>
         </w:rPr>
       </w:pPr>
-      <w:bookmarkStart w:id="9" w:name="projects"/>
+      <w:bookmarkStart w:name="projects" w:id="9"/>
       <w:bookmarkEnd w:id="2"/>
       <w:r>
         <w:br w:type="page"/>
@@ -1781,7 +3125,6 @@
         <w:pStyle w:val="Heading1"/>
       </w:pPr>
       <w:r>
-        <w:lastRenderedPageBreak/>
         <w:t>Projects</w:t>
       </w:r>
     </w:p>
@@ -1789,17 +3132,21 @@
       <w:pPr>
         <w:pStyle w:val="Heading2"/>
       </w:pPr>
-      <w:bookmarkStart w:id="10" w:name="envirocam"/>
+      <w:bookmarkStart w:name="envirocam" w:id="10"/>
     </w:p>
     <w:p>
       <w:pPr>
         <w:pStyle w:val="Heading2"/>
-      </w:pPr>
-      <w:proofErr w:type="spellStart"/>
-      <w:r>
+        <w:rPr>
+          <w:lang w:val="en-US"/>
+        </w:rPr>
+      </w:pPr>
+      <w:r>
+        <w:rPr>
+          <w:lang w:val="en-US"/>
+        </w:rPr>
         <w:t>Envirocam</w:t>
       </w:r>
-      <w:proofErr w:type="spellEnd"/>
     </w:p>
     <w:p>
       <w:pPr>
@@ -1817,7 +3164,7 @@
       <w:r>
         <w:br/>
       </w:r>
-      <w:hyperlink r:id="rId13" w:history="1">
+      <w:hyperlink w:history="1" r:id="rId13">
         <w:r>
           <w:rPr>
             <w:rStyle w:val="Hyperlink"/>
@@ -1827,7 +3174,14 @@
       </w:hyperlink>
     </w:p>
     <w:p>
-      <w:hyperlink r:id="rId14"/>
+      <w:hyperlink r:id="rId14">
+        <w:r>
+          <w:rPr>
+            <w:rStyle w:val="Hyperlink"/>
+          </w:rPr>
+          <w:t>file://github.com/venari/timelapse</w:t>
+        </w:r>
+      </w:hyperlink>
     </w:p>
     <w:bookmarkEnd w:id="10"/>
     <w:p>
@@ -1840,32 +3194,93 @@
     </w:p>
     <w:p>
       <w:r>
-        <w:t>Originating as a tool for creating long term off-grid timelapses of construction and infrastructure projects spanning months or years, this became a platform for remote imagery acquisition. Several of these cameras have been used in the field for a year by a Council for near realtime remote collection of evidence of waterway pollution.</w:t>
-      </w:r>
-    </w:p>
-    <w:p>
-      <w:r>
+        <w:rPr>
+          <w:lang w:val="en-US"/>
+        </w:rPr>
+        <w:t xml:space="preserve">Originating as a tool for creating long term </w:t>
+      </w:r>
+      <w:r>
+        <w:rPr>
+          <w:lang w:val="en-US"/>
+        </w:rPr>
+        <w:t>off-grid</w:t>
+      </w:r>
+      <w:r>
+        <w:rPr>
+          <w:lang w:val="en-US"/>
+        </w:rPr>
+        <w:t xml:space="preserve"> timelapses of construction and infrastructure projects spanning months or years, this became a platform for remote imagery acquisition. Several of these cameras have been used in the field for a year by a Council for near </w:t>
+      </w:r>
+      <w:r>
+        <w:rPr>
+          <w:lang w:val="en-US"/>
+        </w:rPr>
+        <w:t>realtime</w:t>
+      </w:r>
+      <w:r>
+        <w:rPr>
+          <w:lang w:val="en-US"/>
+        </w:rPr>
+        <w:t xml:space="preserve"> remote collection of evidence of waterway pollution.</w:t>
+      </w:r>
+    </w:p>
+    <w:p>
+      <w:r>
+        <w:rPr>
+          <w:lang w:val="en-US"/>
+        </w:rPr>
         <w:t xml:space="preserve">Using a Raspberry Pi, Pi Juice and solar power, these devices can run for months or years without external </w:t>
       </w:r>
-      <w:proofErr w:type="gramStart"/>
-      <w:r>
+      <w:r>
+        <w:rPr>
+          <w:lang w:val="en-US"/>
+        </w:rPr>
         <w:t>power, and</w:t>
       </w:r>
-      <w:proofErr w:type="gramEnd"/>
-      <w:r>
-        <w:t xml:space="preserve"> send telemetry and imagery to a central server ensuring that in the event of theft, imagery is preserved.</w:t>
-      </w:r>
-    </w:p>
-    <w:p>
-      <w:r>
-        <w:t>Offered both as open-source software and hardware with option for self-hosting, and as a managed service to construction industry and enforcement agencies in New Zealand.</w:t>
+      <w:r>
+        <w:rPr>
+          <w:lang w:val="en-US"/>
+        </w:rPr>
+        <w:t xml:space="preserve"> send telemetry and imagery to a central server ensuring that </w:t>
+      </w:r>
+      <w:r>
+        <w:rPr>
+          <w:lang w:val="en-US"/>
+        </w:rPr>
+        <w:t>in the event of</w:t>
+      </w:r>
+      <w:r>
+        <w:rPr>
+          <w:lang w:val="en-US"/>
+        </w:rPr>
+        <w:t xml:space="preserve"> theft, imagery is preserved.</w:t>
+      </w:r>
+    </w:p>
+    <w:p>
+      <w:r>
+        <w:rPr>
+          <w:lang w:val="en-US"/>
+        </w:rPr>
+        <w:t xml:space="preserve">Offered both as open-source software and hardware with </w:t>
+      </w:r>
+      <w:r>
+        <w:rPr>
+          <w:lang w:val="en-US"/>
+        </w:rPr>
+        <w:t>option</w:t>
+      </w:r>
+      <w:r>
+        <w:rPr>
+          <w:lang w:val="en-US"/>
+        </w:rPr>
+        <w:t xml:space="preserve"> for self-hosting, and as a managed service to construction industry and enforcement agencies in New Zealand.</w:t>
       </w:r>
     </w:p>
     <w:p>
       <w:pPr>
         <w:pStyle w:val="Heading2"/>
       </w:pPr>
-      <w:bookmarkStart w:id="11" w:name="drone-hyperlapse-service"/>
+      <w:bookmarkStart w:name="drone-hyperlapse-service" w:id="11"/>
     </w:p>
     <w:p>
       <w:pPr>
@@ -1891,7 +3306,7 @@
       <w:r>
         <w:br/>
       </w:r>
-      <w:hyperlink r:id="rId15" w:history="1">
+      <w:hyperlink w:history="1" r:id="rId15">
         <w:r>
           <w:rPr>
             <w:rStyle w:val="Hyperlink"/>
@@ -1916,14 +3331,53 @@
     </w:p>
     <w:p>
       <w:r>
-        <w:t>In addition to Drone photography and videography, I initiated and refined a drone hyperlapse creation service to help organisations communicate progress of their projects to stakeholders and the public. By aligning and stitching together multiple captures of a site, we create a seamless story to show the progression of projects across many months or years.</w:t>
+        <w:rPr>
+          <w:lang w:val="en-US"/>
+        </w:rPr>
+        <w:t xml:space="preserve">In addition to Drone photography and videography, I </w:t>
+      </w:r>
+      <w:r>
+        <w:rPr>
+          <w:lang w:val="en-US"/>
+        </w:rPr>
+        <w:t>initiated</w:t>
+      </w:r>
+      <w:r>
+        <w:rPr>
+          <w:lang w:val="en-US"/>
+        </w:rPr>
+        <w:t xml:space="preserve"> and refined a drone hyperlapse creation service to help </w:t>
+      </w:r>
+      <w:r>
+        <w:rPr>
+          <w:lang w:val="en-US"/>
+        </w:rPr>
+        <w:t>organisations</w:t>
+      </w:r>
+      <w:r>
+        <w:rPr>
+          <w:lang w:val="en-US"/>
+        </w:rPr>
+        <w:t xml:space="preserve"> communicate </w:t>
+      </w:r>
+      <w:r>
+        <w:rPr>
+          <w:lang w:val="en-US"/>
+        </w:rPr>
+        <w:t>progress</w:t>
+      </w:r>
+      <w:r>
+        <w:rPr>
+          <w:lang w:val="en-US"/>
+        </w:rPr>
+        <w:t xml:space="preserve"> of their projects to stakeholders and the public. By aligning and stitching together multiple captures of a site, we create a seamless story to show the progression of projects across many months or years.</w:t>
       </w:r>
     </w:p>
     <w:p>
       <w:pPr>
         <w:pStyle w:val="Heading2"/>
       </w:pPr>
-      <w:bookmarkStart w:id="12" w:name="pro-bono-it-advice-and-support"/>
+      <w:bookmarkStart w:name="pro-bono-it-advice-and-support" w:id="12"/>
     </w:p>
     <w:p>
       <w:pPr>
@@ -1955,14 +3409,29 @@
     <w:bookmarkEnd w:id="12"/>
     <w:p>
       <w:r>
-        <w:t>I give IT support and advice to a local Women’s Refuge Service in Porirua. In addition to general IT support and procurement assistance, I migrated their office environment to Office 365 and helped migrate systems and records to the cloud.</w:t>
+        <w:rPr>
+          <w:lang w:val="en-US"/>
+        </w:rPr>
+        <w:t xml:space="preserve">I give IT support and advice to a local Women’s Refuge Service in Porirua. In addition to general IT support and procurement </w:t>
+      </w:r>
+      <w:r>
+        <w:rPr>
+          <w:lang w:val="en-US"/>
+        </w:rPr>
+        <w:t>assistance</w:t>
+      </w:r>
+      <w:r>
+        <w:rPr>
+          <w:lang w:val="en-US"/>
+        </w:rPr>
+        <w:t>, I migrated their office environment to Office 365 and helped migrate systems and records to the cloud.</w:t>
       </w:r>
     </w:p>
     <w:p>
       <w:pPr>
         <w:pStyle w:val="Heading2"/>
       </w:pPr>
-      <w:bookmarkStart w:id="13" w:name="coder-dojo-porirua"/>
+      <w:bookmarkStart w:name="coder-dojo-porirua" w:id="13"/>
     </w:p>
     <w:p>
       <w:pPr>
@@ -1988,7 +3457,7 @@
       <w:r>
         <w:br/>
       </w:r>
-      <w:hyperlink r:id="rId16" w:history="1">
+      <w:hyperlink w:history="1" r:id="rId16">
         <w:r>
           <w:rPr>
             <w:rStyle w:val="Hyperlink"/>
@@ -1998,7 +3467,14 @@
       </w:hyperlink>
     </w:p>
     <w:p>
-      <w:hyperlink r:id="rId17"/>
+      <w:hyperlink r:id="rId17">
+        <w:r>
+          <w:rPr>
+            <w:rStyle w:val="Hyperlink"/>
+          </w:rPr>
+          <w:t>https://www.facebook.com/CoderDojoPorirua</w:t>
+        </w:r>
+      </w:hyperlink>
     </w:p>
     <w:bookmarkEnd w:id="13"/>
     <w:p>
@@ -2010,7 +3486,7 @@
       <w:pPr>
         <w:pStyle w:val="Heading2"/>
       </w:pPr>
-      <w:bookmarkStart w:id="14" w:name="tile38-viewer"/>
+      <w:bookmarkStart w:name="tile38-viewer" w:id="14"/>
     </w:p>
     <w:p>
       <w:pPr>
@@ -2029,7 +3505,14 @@
       </w:r>
     </w:p>
     <w:p>
-      <w:hyperlink r:id="rId18"/>
+      <w:hyperlink r:id="rId18">
+        <w:r>
+          <w:rPr>
+            <w:rStyle w:val="Hyperlink"/>
+          </w:rPr>
+          <w:t>https://github.com/leighghunt/tile38-viewer/</w:t>
+        </w:r>
+      </w:hyperlink>
     </w:p>
     <w:bookmarkEnd w:id="14"/>
     <w:p>
@@ -2045,14 +3528,41 @@
         <w:jc w:val="both"/>
       </w:pPr>
       <w:r>
-        <w:t>Developed a tool to visualise geofences and realtime events in Tile38 on a map</w:t>
+        <w:rPr>
+          <w:lang w:val="en-US"/>
+        </w:rPr>
+        <w:t xml:space="preserve">Developed a tool to </w:t>
+      </w:r>
+      <w:r>
+        <w:rPr>
+          <w:lang w:val="en-US"/>
+        </w:rPr>
+        <w:t>visualise</w:t>
+      </w:r>
+      <w:r>
+        <w:rPr>
+          <w:lang w:val="en-US"/>
+        </w:rPr>
+        <w:t xml:space="preserve"> geofences and </w:t>
+      </w:r>
+      <w:r>
+        <w:rPr>
+          <w:lang w:val="en-US"/>
+        </w:rPr>
+        <w:t>realtime</w:t>
+      </w:r>
+      <w:r>
+        <w:rPr>
+          <w:lang w:val="en-US"/>
+        </w:rPr>
+        <w:t xml:space="preserve"> events in Tile38 on a map</w:t>
       </w:r>
     </w:p>
     <w:p>
       <w:pPr>
         <w:pStyle w:val="Heading1"/>
       </w:pPr>
-      <w:bookmarkStart w:id="15" w:name="education"/>
+      <w:bookmarkStart w:name="education" w:id="15"/>
       <w:bookmarkEnd w:id="9"/>
       <w:r>
         <w:t>Education</w:t>
@@ -2062,7 +3572,7 @@
       <w:pPr>
         <w:pStyle w:val="Heading2"/>
       </w:pPr>
-      <w:bookmarkStart w:id="16" w:name="birmingham-university"/>
+      <w:bookmarkStart w:name="birmingham-university" w:id="16"/>
     </w:p>
     <w:p>
       <w:pPr>
@@ -2092,7 +3602,7 @@
       <w:pPr>
         <w:pStyle w:val="Heading1"/>
       </w:pPr>
-      <w:bookmarkStart w:id="17" w:name="a-little-more-about-me"/>
+      <w:bookmarkStart w:name="a-little-more-about-me" w:id="17"/>
       <w:bookmarkEnd w:id="15"/>
       <w:bookmarkEnd w:id="16"/>
       <w:r>
@@ -2106,14 +3616,27 @@
     </w:p>
     <w:p>
       <w:r>
+        <w:rPr>
+          <w:lang w:val="en-US"/>
+        </w:rPr>
         <w:t xml:space="preserve">As part of a household of 7, life is often </w:t>
       </w:r>
-      <w:proofErr w:type="gramStart"/>
-      <w:r>
-        <w:t>pretty busy</w:t>
-      </w:r>
-      <w:proofErr w:type="gramEnd"/>
-      <w:r>
+      <w:r>
+        <w:rPr>
+          <w:lang w:val="en-US"/>
+        </w:rPr>
+        <w:t xml:space="preserve">pretty </w:t>
+      </w:r>
+      <w:r>
+        <w:rPr>
+          <w:lang w:val="en-US"/>
+        </w:rPr>
+        <w:t>busy</w:t>
+      </w:r>
+      <w:r>
+        <w:rPr>
+          <w:lang w:val="en-US"/>
+        </w:rPr>
         <w:t xml:space="preserve"> but when I do find time, alongside my interests in software development and drone flying, some of my other interests and hobbies are:</w:t>
       </w:r>
     </w:p>
@@ -2183,7 +3706,7 @@
       </w:r>
     </w:p>
     <w:sectPr>
-      <w:pgSz w:w="12240" w:h="15840"/>
+      <w:pgSz w:w="12240" w:h="15840" w:orient="portrait"/>
       <w:pgMar w:top="1440" w:right="1440" w:bottom="1440" w:left="1440" w:header="720" w:footer="720" w:gutter="0"/>
       <w:cols w:space="720"/>
     </w:sectPr>
@@ -2404,7 +3927,7 @@
         <w:ind w:left="720" w:hanging="360"/>
       </w:pPr>
       <w:rPr>
-        <w:rFonts w:ascii="Symbol" w:hAnsi="Symbol" w:hint="default"/>
+        <w:rFonts w:hint="default" w:ascii="Symbol" w:hAnsi="Symbol"/>
       </w:rPr>
     </w:lvl>
     <w:lvl w:ilvl="1" w:tplc="08090003" w:tentative="1">
@@ -2416,7 +3939,7 @@
         <w:ind w:left="1440" w:hanging="360"/>
       </w:pPr>
       <w:rPr>
-        <w:rFonts w:ascii="Courier New" w:hAnsi="Courier New" w:cs="Courier New" w:hint="default"/>
+        <w:rFonts w:hint="default" w:ascii="Courier New" w:hAnsi="Courier New" w:cs="Courier New"/>
       </w:rPr>
     </w:lvl>
     <w:lvl w:ilvl="2" w:tplc="08090005" w:tentative="1">
@@ -2428,7 +3951,7 @@
         <w:ind w:left="2160" w:hanging="360"/>
       </w:pPr>
       <w:rPr>
-        <w:rFonts w:ascii="Wingdings" w:hAnsi="Wingdings" w:hint="default"/>
+        <w:rFonts w:hint="default" w:ascii="Wingdings" w:hAnsi="Wingdings"/>
       </w:rPr>
     </w:lvl>
     <w:lvl w:ilvl="3" w:tplc="08090001" w:tentative="1">
@@ -2440,7 +3963,7 @@
         <w:ind w:left="2880" w:hanging="360"/>
       </w:pPr>
       <w:rPr>
-        <w:rFonts w:ascii="Symbol" w:hAnsi="Symbol" w:hint="default"/>
+        <w:rFonts w:hint="default" w:ascii="Symbol" w:hAnsi="Symbol"/>
       </w:rPr>
     </w:lvl>
     <w:lvl w:ilvl="4" w:tplc="08090003" w:tentative="1">
@@ -2452,7 +3975,7 @@
         <w:ind w:left="3600" w:hanging="360"/>
       </w:pPr>
       <w:rPr>
-        <w:rFonts w:ascii="Courier New" w:hAnsi="Courier New" w:cs="Courier New" w:hint="default"/>
+        <w:rFonts w:hint="default" w:ascii="Courier New" w:hAnsi="Courier New" w:cs="Courier New"/>
       </w:rPr>
     </w:lvl>
     <w:lvl w:ilvl="5" w:tplc="08090005" w:tentative="1">
@@ -2464,7 +3987,7 @@
         <w:ind w:left="4320" w:hanging="360"/>
       </w:pPr>
       <w:rPr>
-        <w:rFonts w:ascii="Wingdings" w:hAnsi="Wingdings" w:hint="default"/>
+        <w:rFonts w:hint="default" w:ascii="Wingdings" w:hAnsi="Wingdings"/>
       </w:rPr>
     </w:lvl>
     <w:lvl w:ilvl="6" w:tplc="08090001" w:tentative="1">
@@ -2476,7 +3999,7 @@
         <w:ind w:left="5040" w:hanging="360"/>
       </w:pPr>
       <w:rPr>
-        <w:rFonts w:ascii="Symbol" w:hAnsi="Symbol" w:hint="default"/>
+        <w:rFonts w:hint="default" w:ascii="Symbol" w:hAnsi="Symbol"/>
       </w:rPr>
     </w:lvl>
     <w:lvl w:ilvl="7" w:tplc="08090003" w:tentative="1">
@@ -2488,7 +4011,7 @@
         <w:ind w:left="5760" w:hanging="360"/>
       </w:pPr>
       <w:rPr>
-        <w:rFonts w:ascii="Courier New" w:hAnsi="Courier New" w:cs="Courier New" w:hint="default"/>
+        <w:rFonts w:hint="default" w:ascii="Courier New" w:hAnsi="Courier New" w:cs="Courier New"/>
       </w:rPr>
     </w:lvl>
     <w:lvl w:ilvl="8" w:tplc="08090005" w:tentative="1">
@@ -2500,7 +4023,7 @@
         <w:ind w:left="6480" w:hanging="360"/>
       </w:pPr>
       <w:rPr>
-        <w:rFonts w:ascii="Wingdings" w:hAnsi="Wingdings" w:hint="default"/>
+        <w:rFonts w:hint="default" w:ascii="Wingdings" w:hAnsi="Wingdings"/>
       </w:rPr>
     </w:lvl>
   </w:abstractNum>
@@ -2517,7 +4040,7 @@
         <w:ind w:left="720" w:hanging="360"/>
       </w:pPr>
       <w:rPr>
-        <w:rFonts w:ascii="Symbol" w:hAnsi="Symbol" w:hint="default"/>
+        <w:rFonts w:hint="default" w:ascii="Symbol" w:hAnsi="Symbol"/>
       </w:rPr>
     </w:lvl>
     <w:lvl w:ilvl="1" w:tplc="08090003" w:tentative="1">
@@ -2529,7 +4052,7 @@
         <w:ind w:left="1440" w:hanging="360"/>
       </w:pPr>
       <w:rPr>
-        <w:rFonts w:ascii="Courier New" w:hAnsi="Courier New" w:cs="Courier New" w:hint="default"/>
+        <w:rFonts w:hint="default" w:ascii="Courier New" w:hAnsi="Courier New" w:cs="Courier New"/>
       </w:rPr>
     </w:lvl>
     <w:lvl w:ilvl="2" w:tplc="08090005" w:tentative="1">
@@ -2541,7 +4064,7 @@
         <w:ind w:left="2160" w:hanging="360"/>
       </w:pPr>
       <w:rPr>
-        <w:rFonts w:ascii="Wingdings" w:hAnsi="Wingdings" w:hint="default"/>
+        <w:rFonts w:hint="default" w:ascii="Wingdings" w:hAnsi="Wingdings"/>
       </w:rPr>
     </w:lvl>
     <w:lvl w:ilvl="3" w:tplc="08090001" w:tentative="1">
@@ -2553,7 +4076,7 @@
         <w:ind w:left="2880" w:hanging="360"/>
       </w:pPr>
       <w:rPr>
-        <w:rFonts w:ascii="Symbol" w:hAnsi="Symbol" w:hint="default"/>
+        <w:rFonts w:hint="default" w:ascii="Symbol" w:hAnsi="Symbol"/>
       </w:rPr>
     </w:lvl>
     <w:lvl w:ilvl="4" w:tplc="08090003" w:tentative="1">
@@ -2565,7 +4088,7 @@
         <w:ind w:left="3600" w:hanging="360"/>
       </w:pPr>
       <w:rPr>
-        <w:rFonts w:ascii="Courier New" w:hAnsi="Courier New" w:cs="Courier New" w:hint="default"/>
+        <w:rFonts w:hint="default" w:ascii="Courier New" w:hAnsi="Courier New" w:cs="Courier New"/>
       </w:rPr>
     </w:lvl>
     <w:lvl w:ilvl="5" w:tplc="08090005" w:tentative="1">
@@ -2577,7 +4100,7 @@
         <w:ind w:left="4320" w:hanging="360"/>
       </w:pPr>
       <w:rPr>
-        <w:rFonts w:ascii="Wingdings" w:hAnsi="Wingdings" w:hint="default"/>
+        <w:rFonts w:hint="default" w:ascii="Wingdings" w:hAnsi="Wingdings"/>
       </w:rPr>
     </w:lvl>
     <w:lvl w:ilvl="6" w:tplc="08090001" w:tentative="1">
@@ -2589,7 +4112,7 @@
         <w:ind w:left="5040" w:hanging="360"/>
       </w:pPr>
       <w:rPr>
-        <w:rFonts w:ascii="Symbol" w:hAnsi="Symbol" w:hint="default"/>
+        <w:rFonts w:hint="default" w:ascii="Symbol" w:hAnsi="Symbol"/>
       </w:rPr>
     </w:lvl>
     <w:lvl w:ilvl="7" w:tplc="08090003" w:tentative="1">
@@ -2601,7 +4124,7 @@
         <w:ind w:left="5760" w:hanging="360"/>
       </w:pPr>
       <w:rPr>
-        <w:rFonts w:ascii="Courier New" w:hAnsi="Courier New" w:cs="Courier New" w:hint="default"/>
+        <w:rFonts w:hint="default" w:ascii="Courier New" w:hAnsi="Courier New" w:cs="Courier New"/>
       </w:rPr>
     </w:lvl>
     <w:lvl w:ilvl="8" w:tplc="08090005" w:tentative="1">
@@ -2613,7 +4136,7 @@
         <w:ind w:left="6480" w:hanging="360"/>
       </w:pPr>
       <w:rPr>
-        <w:rFonts w:ascii="Wingdings" w:hAnsi="Wingdings" w:hint="default"/>
+        <w:rFonts w:hint="default" w:ascii="Wingdings" w:hAnsi="Wingdings"/>
       </w:rPr>
     </w:lvl>
   </w:abstractNum>
@@ -2630,7 +4153,7 @@
         <w:ind w:left="720" w:hanging="360"/>
       </w:pPr>
       <w:rPr>
-        <w:rFonts w:ascii="Symbol" w:hAnsi="Symbol" w:hint="default"/>
+        <w:rFonts w:hint="default" w:ascii="Symbol" w:hAnsi="Symbol"/>
       </w:rPr>
     </w:lvl>
     <w:lvl w:ilvl="1" w:tplc="08090003" w:tentative="1">
@@ -2642,7 +4165,7 @@
         <w:ind w:left="1440" w:hanging="360"/>
       </w:pPr>
       <w:rPr>
-        <w:rFonts w:ascii="Courier New" w:hAnsi="Courier New" w:cs="Courier New" w:hint="default"/>
+        <w:rFonts w:hint="default" w:ascii="Courier New" w:hAnsi="Courier New" w:cs="Courier New"/>
       </w:rPr>
     </w:lvl>
     <w:lvl w:ilvl="2" w:tplc="08090005" w:tentative="1">
@@ -2654,7 +4177,7 @@
         <w:ind w:left="2160" w:hanging="360"/>
       </w:pPr>
       <w:rPr>
-        <w:rFonts w:ascii="Wingdings" w:hAnsi="Wingdings" w:hint="default"/>
+        <w:rFonts w:hint="default" w:ascii="Wingdings" w:hAnsi="Wingdings"/>
       </w:rPr>
     </w:lvl>
     <w:lvl w:ilvl="3" w:tplc="08090001" w:tentative="1">
@@ -2666,7 +4189,7 @@
         <w:ind w:left="2880" w:hanging="360"/>
       </w:pPr>
       <w:rPr>
-        <w:rFonts w:ascii="Symbol" w:hAnsi="Symbol" w:hint="default"/>
+        <w:rFonts w:hint="default" w:ascii="Symbol" w:hAnsi="Symbol"/>
       </w:rPr>
     </w:lvl>
     <w:lvl w:ilvl="4" w:tplc="08090003" w:tentative="1">
@@ -2678,7 +4201,7 @@
         <w:ind w:left="3600" w:hanging="360"/>
       </w:pPr>
       <w:rPr>
-        <w:rFonts w:ascii="Courier New" w:hAnsi="Courier New" w:cs="Courier New" w:hint="default"/>
+        <w:rFonts w:hint="default" w:ascii="Courier New" w:hAnsi="Courier New" w:cs="Courier New"/>
       </w:rPr>
     </w:lvl>
     <w:lvl w:ilvl="5" w:tplc="08090005" w:tentative="1">
@@ -2690,7 +4213,7 @@
         <w:ind w:left="4320" w:hanging="360"/>
       </w:pPr>
       <w:rPr>
-        <w:rFonts w:ascii="Wingdings" w:hAnsi="Wingdings" w:hint="default"/>
+        <w:rFonts w:hint="default" w:ascii="Wingdings" w:hAnsi="Wingdings"/>
       </w:rPr>
     </w:lvl>
     <w:lvl w:ilvl="6" w:tplc="08090001" w:tentative="1">
@@ -2702,7 +4225,7 @@
         <w:ind w:left="5040" w:hanging="360"/>
       </w:pPr>
       <w:rPr>
-        <w:rFonts w:ascii="Symbol" w:hAnsi="Symbol" w:hint="default"/>
+        <w:rFonts w:hint="default" w:ascii="Symbol" w:hAnsi="Symbol"/>
       </w:rPr>
     </w:lvl>
     <w:lvl w:ilvl="7" w:tplc="08090003" w:tentative="1">
@@ -2714,7 +4237,7 @@
         <w:ind w:left="5760" w:hanging="360"/>
       </w:pPr>
       <w:rPr>
-        <w:rFonts w:ascii="Courier New" w:hAnsi="Courier New" w:cs="Courier New" w:hint="default"/>
+        <w:rFonts w:hint="default" w:ascii="Courier New" w:hAnsi="Courier New" w:cs="Courier New"/>
       </w:rPr>
     </w:lvl>
     <w:lvl w:ilvl="8" w:tplc="08090005" w:tentative="1">
@@ -2726,7 +4249,7 @@
         <w:ind w:left="6480" w:hanging="360"/>
       </w:pPr>
       <w:rPr>
-        <w:rFonts w:ascii="Wingdings" w:hAnsi="Wingdings" w:hint="default"/>
+        <w:rFonts w:hint="default" w:ascii="Wingdings" w:hAnsi="Wingdings"/>
       </w:rPr>
     </w:lvl>
   </w:abstractNum>
@@ -2758,11 +4281,11 @@
 </file>
 
 <file path=word/styles.xml><?xml version="1.0" encoding="utf-8"?>
-<w:styles xmlns:mc="http://schemas.openxmlformats.org/markup-compatibility/2006" xmlns:r="http://schemas.openxmlformats.org/officeDocument/2006/relationships" xmlns:w="http://schemas.openxmlformats.org/wordprocessingml/2006/main" xmlns:w14="http://schemas.microsoft.com/office/word/2010/wordml" xmlns:w15="http://schemas.microsoft.com/office/word/2012/wordml" xmlns:w16cex="http://schemas.microsoft.com/office/word/2018/wordml/cex" xmlns:w16cid="http://schemas.microsoft.com/office/word/2016/wordml/cid" xmlns:w16="http://schemas.microsoft.com/office/word/2018/wordml" xmlns:w16du="http://schemas.microsoft.com/office/word/2023/wordml/word16du" xmlns:w16sdtdh="http://schemas.microsoft.com/office/word/2020/wordml/sdtdatahash" xmlns:w16se="http://schemas.microsoft.com/office/word/2015/wordml/symex" mc:Ignorable="w14 w15 w16se w16cid w16 w16cex w16sdtdh w16du">
+<w:styles xmlns:wp14="http://schemas.microsoft.com/office/word/2010/wordprocessingDrawing" xmlns:mc="http://schemas.openxmlformats.org/markup-compatibility/2006" xmlns:r="http://schemas.openxmlformats.org/officeDocument/2006/relationships" xmlns:w="http://schemas.openxmlformats.org/wordprocessingml/2006/main" xmlns:w14="http://schemas.microsoft.com/office/word/2010/wordml" xmlns:w15="http://schemas.microsoft.com/office/word/2012/wordml" xmlns:w16cex="http://schemas.microsoft.com/office/word/2018/wordml/cex" xmlns:w16cid="http://schemas.microsoft.com/office/word/2016/wordml/cid" xmlns:w16="http://schemas.microsoft.com/office/word/2018/wordml" xmlns:w16du="http://schemas.microsoft.com/office/word/2023/wordml/word16du" xmlns:w16sdtdh="http://schemas.microsoft.com/office/word/2020/wordml/sdtdatahash" xmlns:w16se="http://schemas.microsoft.com/office/word/2015/wordml/symex" mc:Ignorable="w14 w15 w16se w16cid w16 w16cex w16sdtdh w16du wp14">
   <w:docDefaults>
     <w:rPrDefault>
       <w:rPr>
-        <w:rFonts w:asciiTheme="minorHAnsi" w:eastAsiaTheme="minorHAnsi" w:hAnsiTheme="minorHAnsi" w:cstheme="minorBidi"/>
+        <w:rFonts w:asciiTheme="minorHAnsi" w:hAnsiTheme="minorHAnsi" w:eastAsiaTheme="minorHAnsi" w:cstheme="minorBidi"/>
         <w:sz w:val="24"/>
         <w:szCs w:val="24"/>
         <w:lang w:val="en" w:eastAsia="en-US" w:bidi="ar-SA"/>
@@ -3013,13 +4536,13 @@
     <w:lsdException w:name="List Table 5 Dark Accent 6" w:uiPriority="50"/>
     <w:lsdException w:name="List Table 6 Colorful Accent 6" w:uiPriority="51"/>
     <w:lsdException w:name="List Table 7 Colorful Accent 6" w:uiPriority="52"/>
-    <w:lsdException w:name="Mention" w:semiHidden="1" w:uiPriority="99" w:unhideWhenUsed="1"/>
-    <w:lsdException w:name="Smart Hyperlink" w:semiHidden="1" w:uiPriority="99" w:unhideWhenUsed="1"/>
-    <w:lsdException w:name="Hashtag" w:semiHidden="1" w:uiPriority="99" w:unhideWhenUsed="1"/>
-    <w:lsdException w:name="Unresolved Mention" w:semiHidden="1" w:uiPriority="99" w:unhideWhenUsed="1"/>
-    <w:lsdException w:name="Smart Link" w:semiHidden="1" w:uiPriority="99" w:unhideWhenUsed="1"/>
+    <w:lsdException w:name="Mention" w:uiPriority="99" w:semiHidden="1" w:unhideWhenUsed="1"/>
+    <w:lsdException w:name="Smart Hyperlink" w:uiPriority="99" w:semiHidden="1" w:unhideWhenUsed="1"/>
+    <w:lsdException w:name="Hashtag" w:uiPriority="99" w:semiHidden="1" w:unhideWhenUsed="1"/>
+    <w:lsdException w:name="Unresolved Mention" w:uiPriority="99" w:semiHidden="1" w:unhideWhenUsed="1"/>
+    <w:lsdException w:name="Smart Link" w:uiPriority="99" w:semiHidden="1" w:unhideWhenUsed="1"/>
   </w:latentStyles>
-  <w:style w:type="paragraph" w:default="1" w:styleId="Normal">
+  <w:style w:type="paragraph" w:styleId="Normal" w:default="1">
     <w:name w:val="Normal"/>
     <w:qFormat/>
     <w:rsid w:val="00F940C6"/>
@@ -3061,7 +4584,7 @@
       <w:keepNext/>
       <w:keepLines/>
       <w:pBdr>
-        <w:top w:val="dashed" w:sz="8" w:space="1" w:color="A6A6A6" w:themeColor="background1" w:themeShade="A6"/>
+        <w:top w:val="dashed" w:color="A6A6A6" w:themeColor="background1" w:themeShade="A6" w:sz="8" w:space="1"/>
       </w:pBdr>
       <w:spacing w:after="0"/>
       <w:jc w:val="center"/>
@@ -3209,13 +4732,13 @@
       <w:color w:val="4F81BD" w:themeColor="accent1"/>
     </w:rPr>
   </w:style>
-  <w:style w:type="character" w:default="1" w:styleId="DefaultParagraphFont">
+  <w:style w:type="character" w:styleId="DefaultParagraphFont" w:default="1">
     <w:name w:val="Default Paragraph Font"/>
     <w:uiPriority w:val="1"/>
     <w:semiHidden/>
     <w:unhideWhenUsed/>
   </w:style>
-  <w:style w:type="table" w:default="1" w:styleId="TableNormal">
+  <w:style w:type="table" w:styleId="TableNormal" w:default="1">
     <w:name w:val="Normal Table"/>
     <w:uiPriority w:val="99"/>
     <w:semiHidden/>
@@ -3230,7 +4753,7 @@
       </w:tblCellMar>
     </w:tblPr>
   </w:style>
-  <w:style w:type="numbering" w:default="1" w:styleId="NoList">
+  <w:style w:type="numbering" w:styleId="NoList" w:default="1">
     <w:name w:val="No List"/>
     <w:uiPriority w:val="99"/>
     <w:semiHidden/>
@@ -3244,13 +4767,13 @@
       <w:spacing w:before="180" w:after="180"/>
     </w:pPr>
   </w:style>
-  <w:style w:type="paragraph" w:customStyle="1" w:styleId="FirstParagraph">
+  <w:style w:type="paragraph" w:styleId="FirstParagraph" w:customStyle="1">
     <w:name w:val="First Paragraph"/>
     <w:basedOn w:val="BodyText"/>
     <w:next w:val="BodyText"/>
     <w:qFormat/>
   </w:style>
-  <w:style w:type="paragraph" w:customStyle="1" w:styleId="Compact">
+  <w:style w:type="paragraph" w:styleId="Compact" w:customStyle="1">
     <w:name w:val="Compact"/>
     <w:basedOn w:val="BodyText"/>
     <w:qFormat/>
@@ -3291,7 +4814,7 @@
       <w:szCs w:val="30"/>
     </w:rPr>
   </w:style>
-  <w:style w:type="paragraph" w:customStyle="1" w:styleId="Author">
+  <w:style w:type="paragraph" w:styleId="Author" w:customStyle="1">
     <w:name w:val="Author"/>
     <w:next w:val="BodyText"/>
     <w:qFormat/>
@@ -3311,7 +4834,7 @@
       <w:jc w:val="center"/>
     </w:pPr>
   </w:style>
-  <w:style w:type="paragraph" w:customStyle="1" w:styleId="Abstract">
+  <w:style w:type="paragraph" w:styleId="Abstract" w:customStyle="1">
     <w:name w:val="Abstract"/>
     <w:basedOn w:val="Normal"/>
     <w:next w:val="BodyText"/>
@@ -3350,7 +4873,7 @@
     <w:unhideWhenUsed/>
     <w:qFormat/>
   </w:style>
-  <w:style w:type="table" w:customStyle="1" w:styleId="Table">
+  <w:style w:type="table" w:styleId="Table" w:customStyle="1">
     <w:name w:val="Table"/>
     <w:semiHidden/>
     <w:unhideWhenUsed/>
@@ -3373,13 +4896,13 @@
       </w:trPr>
       <w:tcPr>
         <w:tcBorders>
-          <w:bottom w:val="single" w:sz="0" w:space="0" w:color="auto"/>
+          <w:bottom w:val="single" w:color="auto" w:sz="0" w:space="0"/>
         </w:tcBorders>
         <w:vAlign w:val="bottom"/>
       </w:tcPr>
     </w:tblStylePr>
   </w:style>
-  <w:style w:type="paragraph" w:customStyle="1" w:styleId="DefinitionTerm">
+  <w:style w:type="paragraph" w:styleId="DefinitionTerm" w:customStyle="1">
     <w:name w:val="Definition Term"/>
     <w:basedOn w:val="Normal"/>
     <w:next w:val="Definition"/>
@@ -3392,7 +4915,7 @@
       <w:b/>
     </w:rPr>
   </w:style>
-  <w:style w:type="paragraph" w:customStyle="1" w:styleId="Definition">
+  <w:style w:type="paragraph" w:styleId="Definition" w:customStyle="1">
     <w:name w:val="Definition"/>
     <w:basedOn w:val="Normal"/>
   </w:style>
@@ -3407,34 +4930,34 @@
       <w:i/>
     </w:rPr>
   </w:style>
-  <w:style w:type="paragraph" w:customStyle="1" w:styleId="TableCaption">
+  <w:style w:type="paragraph" w:styleId="TableCaption" w:customStyle="1">
     <w:name w:val="Table Caption"/>
     <w:basedOn w:val="Caption"/>
     <w:pPr>
       <w:keepNext/>
     </w:pPr>
   </w:style>
-  <w:style w:type="paragraph" w:customStyle="1" w:styleId="ImageCaption">
+  <w:style w:type="paragraph" w:styleId="ImageCaption" w:customStyle="1">
     <w:name w:val="Image Caption"/>
     <w:basedOn w:val="Caption"/>
   </w:style>
-  <w:style w:type="paragraph" w:customStyle="1" w:styleId="Figure">
+  <w:style w:type="paragraph" w:styleId="Figure" w:customStyle="1">
     <w:name w:val="Figure"/>
     <w:basedOn w:val="Normal"/>
   </w:style>
-  <w:style w:type="paragraph" w:customStyle="1" w:styleId="CaptionedFigure">
+  <w:style w:type="paragraph" w:styleId="CaptionedFigure" w:customStyle="1">
     <w:name w:val="Captioned Figure"/>
     <w:basedOn w:val="Figure"/>
     <w:pPr>
       <w:keepNext/>
     </w:pPr>
   </w:style>
-  <w:style w:type="character" w:customStyle="1" w:styleId="CaptionChar">
+  <w:style w:type="character" w:styleId="CaptionChar" w:customStyle="1">
     <w:name w:val="Caption Char"/>
     <w:basedOn w:val="DefaultParagraphFont"/>
     <w:link w:val="Caption"/>
   </w:style>
-  <w:style w:type="character" w:customStyle="1" w:styleId="VerbatimChar">
+  <w:style w:type="character" w:styleId="VerbatimChar" w:customStyle="1">
     <w:name w:val="Verbatim Char"/>
     <w:basedOn w:val="CaptionChar"/>
     <w:link w:val="SourceCode"/>
@@ -3443,7 +4966,7 @@
       <w:sz w:val="22"/>
     </w:rPr>
   </w:style>
-  <w:style w:type="character" w:customStyle="1" w:styleId="SectionNumber">
+  <w:style w:type="character" w:styleId="SectionNumber" w:customStyle="1">
     <w:name w:val="Section Number"/>
     <w:basedOn w:val="CaptionChar"/>
   </w:style>
@@ -3478,7 +5001,7 @@
       <w:color w:val="365F91" w:themeColor="accent1" w:themeShade="BF"/>
     </w:rPr>
   </w:style>
-  <w:style w:type="paragraph" w:customStyle="1" w:styleId="SourceCode">
+  <w:style w:type="paragraph" w:styleId="SourceCode" w:customStyle="1">
     <w:name w:val="Source Code"/>
     <w:basedOn w:val="Normal"/>
     <w:link w:val="VerbatimChar"/>
@@ -3486,7 +5009,7 @@
       <w:wordWrap w:val="0"/>
     </w:pPr>
   </w:style>
-  <w:style w:type="character" w:customStyle="1" w:styleId="KeywordTok">
+  <w:style w:type="character" w:styleId="KeywordTok" w:customStyle="1">
     <w:name w:val="KeywordTok"/>
     <w:basedOn w:val="VerbatimChar"/>
     <w:rPr>
@@ -3496,7 +5019,7 @@
       <w:sz w:val="22"/>
     </w:rPr>
   </w:style>
-  <w:style w:type="character" w:customStyle="1" w:styleId="DataTypeTok">
+  <w:style w:type="character" w:styleId="DataTypeTok" w:customStyle="1">
     <w:name w:val="DataTypeTok"/>
     <w:basedOn w:val="VerbatimChar"/>
     <w:rPr>
@@ -3505,7 +5028,7 @@
       <w:sz w:val="22"/>
     </w:rPr>
   </w:style>
-  <w:style w:type="character" w:customStyle="1" w:styleId="DecValTok">
+  <w:style w:type="character" w:styleId="DecValTok" w:customStyle="1">
     <w:name w:val="DecValTok"/>
     <w:basedOn w:val="VerbatimChar"/>
     <w:rPr>
@@ -3514,7 +5037,7 @@
       <w:sz w:val="22"/>
     </w:rPr>
   </w:style>
-  <w:style w:type="character" w:customStyle="1" w:styleId="BaseNTok">
+  <w:style w:type="character" w:styleId="BaseNTok" w:customStyle="1">
     <w:name w:val="BaseNTok"/>
     <w:basedOn w:val="VerbatimChar"/>
     <w:rPr>
@@ -3523,7 +5046,7 @@
       <w:sz w:val="22"/>
     </w:rPr>
   </w:style>
-  <w:style w:type="character" w:customStyle="1" w:styleId="FloatTok">
+  <w:style w:type="character" w:styleId="FloatTok" w:customStyle="1">
     <w:name w:val="FloatTok"/>
     <w:basedOn w:val="VerbatimChar"/>
     <w:rPr>
@@ -3532,7 +5055,7 @@
       <w:sz w:val="22"/>
     </w:rPr>
   </w:style>
-  <w:style w:type="character" w:customStyle="1" w:styleId="ConstantTok">
+  <w:style w:type="character" w:styleId="ConstantTok" w:customStyle="1">
     <w:name w:val="ConstantTok"/>
     <w:basedOn w:val="VerbatimChar"/>
     <w:rPr>
@@ -3541,7 +5064,7 @@
       <w:sz w:val="22"/>
     </w:rPr>
   </w:style>
-  <w:style w:type="character" w:customStyle="1" w:styleId="CharTok">
+  <w:style w:type="character" w:styleId="CharTok" w:customStyle="1">
     <w:name w:val="CharTok"/>
     <w:basedOn w:val="VerbatimChar"/>
     <w:rPr>
@@ -3550,7 +5073,7 @@
       <w:sz w:val="22"/>
     </w:rPr>
   </w:style>
-  <w:style w:type="character" w:customStyle="1" w:styleId="SpecialCharTok">
+  <w:style w:type="character" w:styleId="SpecialCharTok" w:customStyle="1">
     <w:name w:val="SpecialCharTok"/>
     <w:basedOn w:val="VerbatimChar"/>
     <w:rPr>
@@ -3559,7 +5082,7 @@
       <w:sz w:val="22"/>
     </w:rPr>
   </w:style>
-  <w:style w:type="character" w:customStyle="1" w:styleId="StringTok">
+  <w:style w:type="character" w:styleId="StringTok" w:customStyle="1">
     <w:name w:val="StringTok"/>
     <w:basedOn w:val="VerbatimChar"/>
     <w:rPr>
@@ -3568,7 +5091,7 @@
       <w:sz w:val="22"/>
     </w:rPr>
   </w:style>
-  <w:style w:type="character" w:customStyle="1" w:styleId="VerbatimStringTok">
+  <w:style w:type="character" w:styleId="VerbatimStringTok" w:customStyle="1">
     <w:name w:val="VerbatimStringTok"/>
     <w:basedOn w:val="VerbatimChar"/>
     <w:rPr>
@@ -3577,7 +5100,7 @@
       <w:sz w:val="22"/>
     </w:rPr>
   </w:style>
-  <w:style w:type="character" w:customStyle="1" w:styleId="SpecialStringTok">
+  <w:style w:type="character" w:styleId="SpecialStringTok" w:customStyle="1">
     <w:name w:val="SpecialStringTok"/>
     <w:basedOn w:val="VerbatimChar"/>
     <w:rPr>
@@ -3586,7 +5109,7 @@
       <w:sz w:val="22"/>
     </w:rPr>
   </w:style>
-  <w:style w:type="character" w:customStyle="1" w:styleId="ImportTok">
+  <w:style w:type="character" w:styleId="ImportTok" w:customStyle="1">
     <w:name w:val="ImportTok"/>
     <w:basedOn w:val="VerbatimChar"/>
     <w:rPr>
@@ -3594,7 +5117,7 @@
       <w:sz w:val="22"/>
     </w:rPr>
   </w:style>
-  <w:style w:type="character" w:customStyle="1" w:styleId="CommentTok">
+  <w:style w:type="character" w:styleId="CommentTok" w:customStyle="1">
     <w:name w:val="CommentTok"/>
     <w:basedOn w:val="VerbatimChar"/>
     <w:rPr>
@@ -3604,7 +5127,7 @@
       <w:sz w:val="22"/>
     </w:rPr>
   </w:style>
-  <w:style w:type="character" w:customStyle="1" w:styleId="DocumentationTok">
+  <w:style w:type="character" w:styleId="DocumentationTok" w:customStyle="1">
     <w:name w:val="DocumentationTok"/>
     <w:basedOn w:val="VerbatimChar"/>
     <w:rPr>
@@ -3614,7 +5137,7 @@
       <w:sz w:val="22"/>
     </w:rPr>
   </w:style>
-  <w:style w:type="character" w:customStyle="1" w:styleId="AnnotationTok">
+  <w:style w:type="character" w:styleId="AnnotationTok" w:customStyle="1">
     <w:name w:val="AnnotationTok"/>
     <w:basedOn w:val="VerbatimChar"/>
     <w:rPr>
@@ -3625,7 +5148,7 @@
       <w:sz w:val="22"/>
     </w:rPr>
   </w:style>
-  <w:style w:type="character" w:customStyle="1" w:styleId="CommentVarTok">
+  <w:style w:type="character" w:styleId="CommentVarTok" w:customStyle="1">
     <w:name w:val="CommentVarTok"/>
     <w:basedOn w:val="VerbatimChar"/>
     <w:rPr>
@@ -3636,7 +5159,7 @@
       <w:sz w:val="22"/>
     </w:rPr>
   </w:style>
-  <w:style w:type="character" w:customStyle="1" w:styleId="OtherTok">
+  <w:style w:type="character" w:styleId="OtherTok" w:customStyle="1">
     <w:name w:val="OtherTok"/>
     <w:basedOn w:val="VerbatimChar"/>
     <w:rPr>
@@ -3645,7 +5168,7 @@
       <w:sz w:val="22"/>
     </w:rPr>
   </w:style>
-  <w:style w:type="character" w:customStyle="1" w:styleId="FunctionTok">
+  <w:style w:type="character" w:styleId="FunctionTok" w:customStyle="1">
     <w:name w:val="FunctionTok"/>
     <w:basedOn w:val="VerbatimChar"/>
     <w:rPr>
@@ -3654,7 +5177,7 @@
       <w:sz w:val="22"/>
     </w:rPr>
   </w:style>
-  <w:style w:type="character" w:customStyle="1" w:styleId="VariableTok">
+  <w:style w:type="character" w:styleId="VariableTok" w:customStyle="1">
     <w:name w:val="VariableTok"/>
     <w:basedOn w:val="VerbatimChar"/>
     <w:rPr>
@@ -3663,7 +5186,7 @@
       <w:sz w:val="22"/>
     </w:rPr>
   </w:style>
-  <w:style w:type="character" w:customStyle="1" w:styleId="ControlFlowTok">
+  <w:style w:type="character" w:styleId="ControlFlowTok" w:customStyle="1">
     <w:name w:val="ControlFlowTok"/>
     <w:basedOn w:val="VerbatimChar"/>
     <w:rPr>
@@ -3673,7 +5196,7 @@
       <w:sz w:val="22"/>
     </w:rPr>
   </w:style>
-  <w:style w:type="character" w:customStyle="1" w:styleId="OperatorTok">
+  <w:style w:type="character" w:styleId="OperatorTok" w:customStyle="1">
     <w:name w:val="OperatorTok"/>
     <w:basedOn w:val="VerbatimChar"/>
     <w:rPr>
@@ -3682,7 +5205,7 @@
       <w:sz w:val="22"/>
     </w:rPr>
   </w:style>
-  <w:style w:type="character" w:customStyle="1" w:styleId="BuiltInTok">
+  <w:style w:type="character" w:styleId="BuiltInTok" w:customStyle="1">
     <w:name w:val="BuiltInTok"/>
     <w:basedOn w:val="VerbatimChar"/>
     <w:rPr>
@@ -3690,7 +5213,7 @@
       <w:sz w:val="22"/>
     </w:rPr>
   </w:style>
-  <w:style w:type="character" w:customStyle="1" w:styleId="ExtensionTok">
+  <w:style w:type="character" w:styleId="ExtensionTok" w:customStyle="1">
     <w:name w:val="ExtensionTok"/>
     <w:basedOn w:val="VerbatimChar"/>
     <w:rPr>
@@ -3698,7 +5221,7 @@
       <w:sz w:val="22"/>
     </w:rPr>
   </w:style>
-  <w:style w:type="character" w:customStyle="1" w:styleId="PreprocessorTok">
+  <w:style w:type="character" w:styleId="PreprocessorTok" w:customStyle="1">
     <w:name w:val="PreprocessorTok"/>
     <w:basedOn w:val="VerbatimChar"/>
     <w:rPr>
@@ -3707,7 +5230,7 @@
       <w:sz w:val="22"/>
     </w:rPr>
   </w:style>
-  <w:style w:type="character" w:customStyle="1" w:styleId="AttributeTok">
+  <w:style w:type="character" w:styleId="AttributeTok" w:customStyle="1">
     <w:name w:val="AttributeTok"/>
     <w:basedOn w:val="VerbatimChar"/>
     <w:rPr>
@@ -3716,7 +5239,7 @@
       <w:sz w:val="22"/>
     </w:rPr>
   </w:style>
-  <w:style w:type="character" w:customStyle="1" w:styleId="RegionMarkerTok">
+  <w:style w:type="character" w:styleId="RegionMarkerTok" w:customStyle="1">
     <w:name w:val="RegionMarkerTok"/>
     <w:basedOn w:val="VerbatimChar"/>
     <w:rPr>
@@ -3724,7 +5247,7 @@
       <w:sz w:val="22"/>
     </w:rPr>
   </w:style>
-  <w:style w:type="character" w:customStyle="1" w:styleId="InformationTok">
+  <w:style w:type="character" w:styleId="InformationTok" w:customStyle="1">
     <w:name w:val="InformationTok"/>
     <w:basedOn w:val="VerbatimChar"/>
     <w:rPr>
@@ -3735,7 +5258,7 @@
       <w:sz w:val="22"/>
     </w:rPr>
   </w:style>
-  <w:style w:type="character" w:customStyle="1" w:styleId="WarningTok">
+  <w:style w:type="character" w:styleId="WarningTok" w:customStyle="1">
     <w:name w:val="WarningTok"/>
     <w:basedOn w:val="VerbatimChar"/>
     <w:rPr>
@@ -3746,7 +5269,7 @@
       <w:sz w:val="22"/>
     </w:rPr>
   </w:style>
-  <w:style w:type="character" w:customStyle="1" w:styleId="AlertTok">
+  <w:style w:type="character" w:styleId="AlertTok" w:customStyle="1">
     <w:name w:val="AlertTok"/>
     <w:basedOn w:val="VerbatimChar"/>
     <w:rPr>
@@ -3756,7 +5279,7 @@
       <w:sz w:val="22"/>
     </w:rPr>
   </w:style>
-  <w:style w:type="character" w:customStyle="1" w:styleId="ErrorTok">
+  <w:style w:type="character" w:styleId="ErrorTok" w:customStyle="1">
     <w:name w:val="ErrorTok"/>
     <w:basedOn w:val="VerbatimChar"/>
     <w:rPr>
@@ -3766,7 +5289,7 @@
       <w:sz w:val="22"/>
     </w:rPr>
   </w:style>
-  <w:style w:type="character" w:customStyle="1" w:styleId="NormalTok">
+  <w:style w:type="character" w:styleId="NormalTok" w:customStyle="1">
     <w:name w:val="NormalTok"/>
     <w:basedOn w:val="VerbatimChar"/>
     <w:rPr>
@@ -3787,7 +5310,7 @@
       <w:spacing w:after="0"/>
     </w:pPr>
   </w:style>
-  <w:style w:type="character" w:customStyle="1" w:styleId="HeaderChar">
+  <w:style w:type="character" w:styleId="HeaderChar" w:customStyle="1">
     <w:name w:val="Header Char"/>
     <w:basedOn w:val="DefaultParagraphFont"/>
     <w:link w:val="Header"/>
@@ -3806,7 +5329,7 @@
       <w:spacing w:after="0"/>
     </w:pPr>
   </w:style>
-  <w:style w:type="character" w:customStyle="1" w:styleId="FooterChar">
+  <w:style w:type="character" w:styleId="FooterChar" w:customStyle="1">
     <w:name w:val="Footer Char"/>
     <w:basedOn w:val="DefaultParagraphFont"/>
     <w:link w:val="Footer"/>
@@ -3821,12 +5344,12 @@
     </w:pPr>
     <w:tblPr>
       <w:tblBorders>
-        <w:top w:val="single" w:sz="4" w:space="0" w:color="auto"/>
-        <w:left w:val="single" w:sz="4" w:space="0" w:color="auto"/>
-        <w:bottom w:val="single" w:sz="4" w:space="0" w:color="auto"/>
-        <w:right w:val="single" w:sz="4" w:space="0" w:color="auto"/>
-        <w:insideH w:val="single" w:sz="4" w:space="0" w:color="auto"/>
-        <w:insideV w:val="single" w:sz="4" w:space="0" w:color="auto"/>
+        <w:top w:val="single" w:color="auto" w:sz="4" w:space="0"/>
+        <w:left w:val="single" w:color="auto" w:sz="4" w:space="0"/>
+        <w:bottom w:val="single" w:color="auto" w:sz="4" w:space="0"/>
+        <w:right w:val="single" w:color="auto" w:sz="4" w:space="0"/>
+        <w:insideH w:val="single" w:color="auto" w:sz="4" w:space="0"/>
+        <w:insideV w:val="single" w:color="auto" w:sz="4" w:space="0"/>
       </w:tblBorders>
     </w:tblPr>
   </w:style>
@@ -3840,11 +5363,11 @@
       <w:spacing w:before="100" w:beforeAutospacing="1" w:after="100" w:afterAutospacing="1"/>
     </w:pPr>
     <w:rPr>
-      <w:rFonts w:ascii="Times New Roman" w:eastAsia="Times New Roman" w:hAnsi="Times New Roman" w:cs="Times New Roman"/>
+      <w:rFonts w:ascii="Times New Roman" w:hAnsi="Times New Roman" w:eastAsia="Times New Roman" w:cs="Times New Roman"/>
       <w:lang w:val="en-NZ" w:eastAsia="en-GB"/>
     </w:rPr>
   </w:style>
-  <w:style w:type="paragraph" w:customStyle="1" w:styleId="Placement">
+  <w:style w:type="paragraph" w:styleId="Placement" w:customStyle="1">
     <w:name w:val="Placement"/>
     <w:basedOn w:val="Normal"/>
     <w:qFormat/>
@@ -3857,7 +5380,7 @@
       <w:bCs/>
     </w:rPr>
   </w:style>
-  <w:style w:type="paragraph" w:customStyle="1" w:styleId="Skills">
+  <w:style w:type="paragraph" w:styleId="Skills" w:customStyle="1">
     <w:name w:val="Skills"/>
     <w:basedOn w:val="Normal"/>
     <w:qFormat/>
@@ -3887,14 +5410,14 @@
       <w:shd w:val="clear" w:color="auto" w:fill="E1DFDD"/>
     </w:rPr>
   </w:style>
-  <w:style w:type="paragraph" w:customStyle="1" w:styleId="Nametitle">
+  <w:style w:type="paragraph" w:styleId="Nametitle" w:customStyle="1">
     <w:name w:val="Name title"/>
     <w:basedOn w:val="Heading2"/>
     <w:qFormat/>
     <w:rsid w:val="004C765A"/>
     <w:pPr>
       <w:pBdr>
-        <w:top w:val="none" w:sz="0" w:space="0" w:color="auto"/>
+        <w:top w:val="none" w:color="auto" w:sz="0" w:space="0"/>
       </w:pBdr>
       <w:jc w:val="left"/>
     </w:pPr>

</xml_diff>